<commit_message>
V3R mirror 2026-03-19 12:00 UTC
</commit_message>
<xml_diff>
--- a/code/current/lambda_orchestrator.docx
+++ b/code/current/lambda_orchestrator.docx
@@ -139,162 +139,240 @@
         <w:rPr>
           <w:rtl w:val="0"/>
         </w:rPr>
-        <w:t xml:space="preserve"># MODERATOR routes to 'orchestration' -- quality tier, task decomposition</w:t>
-      </w:r>
-    </w:p>
-    <w:p>
-      <w:pPr>
-        <w:keepNext w:val="0"/>
-        <w:keepLines w:val="0"/>
-        <w:pageBreakBefore w:val="0"/>
-        <w:widowControl w:val="0"/>
-        <w:pBdr>
-          <w:top w:space="0" w:sz="0" w:val="nil"/>
-          <w:left w:space="0" w:sz="0" w:val="nil"/>
-          <w:bottom w:space="0" w:sz="0" w:val="nil"/>
-          <w:right w:space="0" w:sz="0" w:val="nil"/>
-          <w:between w:space="0" w:sz="0" w:val="nil"/>
-        </w:pBdr>
-        <w:shd w:fill="auto" w:val="clear"/>
-        <w:spacing w:after="0" w:before="0" w:line="276" w:lineRule="auto"/>
-        <w:ind w:left="0" w:right="0" w:firstLine="0"/>
-        <w:jc w:val="left"/>
-        <w:rPr/>
-      </w:pPr>
-      <w:r>
-        <w:rPr>
-          <w:rtl w:val="0"/>
-        </w:rPr>
-        <w:t xml:space="preserve"># KNOWLEDGE RETRIEVAL routes to 'retrieval' -- sourced constraint-aware information</w:t>
-      </w:r>
-    </w:p>
-    <w:p>
-      <w:pPr>
-        <w:keepNext w:val="0"/>
-        <w:keepLines w:val="0"/>
-        <w:pageBreakBefore w:val="0"/>
-        <w:widowControl w:val="0"/>
-        <w:pBdr>
-          <w:top w:space="0" w:sz="0" w:val="nil"/>
-          <w:left w:space="0" w:sz="0" w:val="nil"/>
-          <w:bottom w:space="0" w:sz="0" w:val="nil"/>
-          <w:right w:space="0" w:sz="0" w:val="nil"/>
-          <w:between w:space="0" w:sz="0" w:val="nil"/>
-        </w:pBdr>
-        <w:shd w:fill="auto" w:val="clear"/>
-        <w:spacing w:after="0" w:before="0" w:line="276" w:lineRule="auto"/>
-        <w:ind w:left="0" w:right="0" w:firstLine="0"/>
-        <w:jc w:val="left"/>
-        <w:rPr/>
-      </w:pPr>
-      <w:r>
-        <w:rPr>
-          <w:rtl w:val="0"/>
-        </w:rPr>
-        <w:t xml:space="preserve"># CODER routes to 'code' -- production-grade platform-compatible generation, max_tokens=2048</w:t>
-      </w:r>
-    </w:p>
-    <w:p>
-      <w:pPr>
-        <w:keepNext w:val="0"/>
-        <w:keepLines w:val="0"/>
-        <w:pageBreakBefore w:val="0"/>
-        <w:widowControl w:val="0"/>
-        <w:pBdr>
-          <w:top w:space="0" w:sz="0" w:val="nil"/>
-          <w:left w:space="0" w:sz="0" w:val="nil"/>
-          <w:bottom w:space="0" w:sz="0" w:val="nil"/>
-          <w:right w:space="0" w:sz="0" w:val="nil"/>
-          <w:between w:space="0" w:sz="0" w:val="nil"/>
-        </w:pBdr>
-        <w:shd w:fill="auto" w:val="clear"/>
-        <w:spacing w:after="0" w:before="0" w:line="276" w:lineRule="auto"/>
-        <w:ind w:left="0" w:right="0" w:firstLine="0"/>
-        <w:jc w:val="left"/>
-        <w:rPr/>
-      </w:pPr>
-      <w:r>
-        <w:rPr>
-          <w:rtl w:val="0"/>
-        </w:rPr>
-        <w:t xml:space="preserve"># SYSTEM DEBUG routes to 'reasoning' -- chain-of-thought validation gate, max_tokens=2048</w:t>
-      </w:r>
-    </w:p>
-    <w:p>
-      <w:pPr>
-        <w:keepNext w:val="0"/>
-        <w:keepLines w:val="0"/>
-        <w:pageBreakBefore w:val="0"/>
-        <w:widowControl w:val="0"/>
-        <w:pBdr>
-          <w:top w:space="0" w:sz="0" w:val="nil"/>
-          <w:left w:space="0" w:sz="0" w:val="nil"/>
-          <w:bottom w:space="0" w:sz="0" w:val="nil"/>
-          <w:right w:space="0" w:sz="0" w:val="nil"/>
-          <w:between w:space="0" w:sz="0" w:val="nil"/>
-        </w:pBdr>
-        <w:shd w:fill="auto" w:val="clear"/>
-        <w:spacing w:after="0" w:before="0" w:line="276" w:lineRule="auto"/>
-        <w:ind w:left="0" w:right="0" w:firstLine="0"/>
-        <w:jc w:val="left"/>
-        <w:rPr/>
-      </w:pPr>
-      <w:r>
-        <w:rPr>
-          <w:rtl w:val="0"/>
-        </w:rPr>
-        <w:t xml:space="preserve"># No direct LLM calls -- all execution via route_llm()</w:t>
-      </w:r>
-    </w:p>
-    <w:p>
-      <w:pPr>
-        <w:keepNext w:val="0"/>
-        <w:keepLines w:val="0"/>
-        <w:pageBreakBefore w:val="0"/>
-        <w:widowControl w:val="0"/>
-        <w:pBdr>
-          <w:top w:space="0" w:sz="0" w:val="nil"/>
-          <w:left w:space="0" w:sz="0" w:val="nil"/>
-          <w:bottom w:space="0" w:sz="0" w:val="nil"/>
-          <w:right w:space="0" w:sz="0" w:val="nil"/>
-          <w:between w:space="0" w:sz="0" w:val="nil"/>
-        </w:pBdr>
-        <w:shd w:fill="auto" w:val="clear"/>
-        <w:spacing w:after="0" w:before="0" w:line="276" w:lineRule="auto"/>
-        <w:ind w:left="0" w:right="0" w:firstLine="0"/>
-        <w:jc w:val="left"/>
-        <w:rPr/>
-      </w:pPr>
-      <w:r>
-        <w:rPr>
-          <w:rtl w:val="0"/>
-        </w:rPr>
-        <w:t xml:space="preserve"># temperature=0.3 preserved from original for all agents</w:t>
-      </w:r>
-    </w:p>
-    <w:p>
-      <w:pPr>
-        <w:keepNext w:val="0"/>
-        <w:keepLines w:val="0"/>
-        <w:pageBreakBefore w:val="0"/>
-        <w:widowControl w:val="0"/>
-        <w:pBdr>
-          <w:top w:space="0" w:sz="0" w:val="nil"/>
-          <w:left w:space="0" w:sz="0" w:val="nil"/>
-          <w:bottom w:space="0" w:sz="0" w:val="nil"/>
-          <w:right w:space="0" w:sz="0" w:val="nil"/>
-          <w:between w:space="0" w:sz="0" w:val="nil"/>
-        </w:pBdr>
-        <w:shd w:fill="auto" w:val="clear"/>
-        <w:spacing w:after="0" w:before="0" w:line="276" w:lineRule="auto"/>
-        <w:ind w:left="0" w:right="0" w:firstLine="0"/>
-        <w:jc w:val="left"/>
-        <w:rPr/>
-      </w:pPr>
-      <w:r>
-        <w:rPr>
-          <w:rtl w:val="0"/>
-        </w:rPr>
+        <w:t xml:space="preserve"># V3.2 -- SQS coordination layer added (MT-02)</w:t>
+      </w:r>
+    </w:p>
+    <w:p>
+      <w:pPr>
+        <w:keepNext w:val="0"/>
+        <w:keepLines w:val="0"/>
+        <w:pageBreakBefore w:val="0"/>
+        <w:widowControl w:val="0"/>
+        <w:pBdr>
+          <w:top w:space="0" w:sz="0" w:val="nil"/>
+          <w:left w:space="0" w:sz="0" w:val="nil"/>
+          <w:bottom w:space="0" w:sz="0" w:val="nil"/>
+          <w:right w:space="0" w:sz="0" w:val="nil"/>
+          <w:between w:space="0" w:sz="0" w:val="nil"/>
+        </w:pBdr>
+        <w:shd w:fill="auto" w:val="clear"/>
+        <w:spacing w:after="0" w:before="0" w:line="276" w:lineRule="auto"/>
+        <w:ind w:left="0" w:right="0" w:firstLine="0"/>
+        <w:jc w:val="left"/>
+        <w:rPr/>
+      </w:pPr>
+      <w:r>
+        <w:rPr>
+          <w:rtl w:val="0"/>
+        </w:rPr>
+        <w:t xml:space="preserve"># MODERATOR routes to 'orchestration' tier -- quality reasoning</w:t>
+      </w:r>
+    </w:p>
+    <w:p>
+      <w:pPr>
+        <w:keepNext w:val="0"/>
+        <w:keepLines w:val="0"/>
+        <w:pageBreakBefore w:val="0"/>
+        <w:widowControl w:val="0"/>
+        <w:pBdr>
+          <w:top w:space="0" w:sz="0" w:val="nil"/>
+          <w:left w:space="0" w:sz="0" w:val="nil"/>
+          <w:bottom w:space="0" w:sz="0" w:val="nil"/>
+          <w:right w:space="0" w:sz="0" w:val="nil"/>
+          <w:between w:space="0" w:sz="0" w:val="nil"/>
+        </w:pBdr>
+        <w:shd w:fill="auto" w:val="clear"/>
+        <w:spacing w:after="0" w:before="0" w:line="276" w:lineRule="auto"/>
+        <w:ind w:left="0" w:right="0" w:firstLine="0"/>
+        <w:jc w:val="left"/>
+        <w:rPr/>
+      </w:pPr>
+      <w:r>
+        <w:rPr>
+          <w:rtl w:val="0"/>
+        </w:rPr>
+        <w:t xml:space="preserve"># KNOWLEDGE RETRIEVAL routes to 'retrieval' tier</w:t>
+      </w:r>
+    </w:p>
+    <w:p>
+      <w:pPr>
+        <w:keepNext w:val="0"/>
+        <w:keepLines w:val="0"/>
+        <w:pageBreakBefore w:val="0"/>
+        <w:widowControl w:val="0"/>
+        <w:pBdr>
+          <w:top w:space="0" w:sz="0" w:val="nil"/>
+          <w:left w:space="0" w:sz="0" w:val="nil"/>
+          <w:bottom w:space="0" w:sz="0" w:val="nil"/>
+          <w:right w:space="0" w:sz="0" w:val="nil"/>
+          <w:between w:space="0" w:sz="0" w:val="nil"/>
+        </w:pBdr>
+        <w:shd w:fill="auto" w:val="clear"/>
+        <w:spacing w:after="0" w:before="0" w:line="276" w:lineRule="auto"/>
+        <w:ind w:left="0" w:right="0" w:firstLine="0"/>
+        <w:jc w:val="left"/>
+        <w:rPr/>
+      </w:pPr>
+      <w:r>
+        <w:rPr>
+          <w:rtl w:val="0"/>
+        </w:rPr>
+        <w:t xml:space="preserve"># CODER routes to 'code' tier -- max_tokens=2048</w:t>
+      </w:r>
+    </w:p>
+    <w:p>
+      <w:pPr>
+        <w:keepNext w:val="0"/>
+        <w:keepLines w:val="0"/>
+        <w:pageBreakBefore w:val="0"/>
+        <w:widowControl w:val="0"/>
+        <w:pBdr>
+          <w:top w:space="0" w:sz="0" w:val="nil"/>
+          <w:left w:space="0" w:sz="0" w:val="nil"/>
+          <w:bottom w:space="0" w:sz="0" w:val="nil"/>
+          <w:right w:space="0" w:sz="0" w:val="nil"/>
+          <w:between w:space="0" w:sz="0" w:val="nil"/>
+        </w:pBdr>
+        <w:shd w:fill="auto" w:val="clear"/>
+        <w:spacing w:after="0" w:before="0" w:line="276" w:lineRule="auto"/>
+        <w:ind w:left="0" w:right="0" w:firstLine="0"/>
+        <w:jc w:val="left"/>
+        <w:rPr/>
+      </w:pPr>
+      <w:r>
+        <w:rPr>
+          <w:rtl w:val="0"/>
+        </w:rPr>
+        <w:t xml:space="preserve"># SYSTEM DEBUG routes to 'reasoning' tier -- max_tokens=2048</w:t>
+      </w:r>
+    </w:p>
+    <w:p>
+      <w:pPr>
+        <w:keepNext w:val="0"/>
+        <w:keepLines w:val="0"/>
+        <w:pageBreakBefore w:val="0"/>
+        <w:widowControl w:val="0"/>
+        <w:pBdr>
+          <w:top w:space="0" w:sz="0" w:val="nil"/>
+          <w:left w:space="0" w:sz="0" w:val="nil"/>
+          <w:bottom w:space="0" w:sz="0" w:val="nil"/>
+          <w:right w:space="0" w:sz="0" w:val="nil"/>
+          <w:between w:space="0" w:sz="0" w:val="nil"/>
+        </w:pBdr>
+        <w:shd w:fill="auto" w:val="clear"/>
+        <w:spacing w:after="0" w:before="0" w:line="276" w:lineRule="auto"/>
+        <w:ind w:left="0" w:right="0" w:firstLine="0"/>
+        <w:jc w:val="left"/>
+        <w:rPr/>
+      </w:pPr>
+      <w:r>
+        <w:rPr>
+          <w:rtl w:val="0"/>
+        </w:rPr>
+        <w:t xml:space="preserve"># SQS FIFO queues used for agent coordination and parallel execution</w:t>
+      </w:r>
+    </w:p>
+    <w:p>
+      <w:pPr>
+        <w:keepNext w:val="0"/>
+        <w:keepLines w:val="0"/>
+        <w:pageBreakBefore w:val="0"/>
+        <w:widowControl w:val="0"/>
+        <w:pBdr>
+          <w:top w:space="0" w:sz="0" w:val="nil"/>
+          <w:left w:space="0" w:sz="0" w:val="nil"/>
+          <w:bottom w:space="0" w:sz="0" w:val="nil"/>
+          <w:right w:space="0" w:sz="0" w:val="nil"/>
+          <w:between w:space="0" w:sz="0" w:val="nil"/>
+        </w:pBdr>
+        <w:shd w:fill="auto" w:val="clear"/>
+        <w:spacing w:after="0" w:before="0" w:line="276" w:lineRule="auto"/>
+        <w:ind w:left="0" w:right="0" w:firstLine="0"/>
+        <w:jc w:val="left"/>
+        <w:rPr/>
+      </w:pPr>
+      <w:r>
+        <w:rPr>
+          <w:rtl w:val="0"/>
+        </w:rPr>
+        <w:t xml:space="preserve"># Falls back to direct execution if SQS poll times out</w:t>
+      </w:r>
+    </w:p>
+    <w:p>
+      <w:pPr>
+        <w:keepNext w:val="0"/>
+        <w:keepLines w:val="0"/>
+        <w:pageBreakBefore w:val="0"/>
+        <w:widowControl w:val="0"/>
+        <w:pBdr>
+          <w:top w:space="0" w:sz="0" w:val="nil"/>
+          <w:left w:space="0" w:sz="0" w:val="nil"/>
+          <w:bottom w:space="0" w:sz="0" w:val="nil"/>
+          <w:right w:space="0" w:sz="0" w:val="nil"/>
+          <w:between w:space="0" w:sz="0" w:val="nil"/>
+        </w:pBdr>
+        <w:shd w:fill="auto" w:val="clear"/>
+        <w:spacing w:after="0" w:before="0" w:line="276" w:lineRule="auto"/>
+        <w:ind w:left="0" w:right="0" w:firstLine="0"/>
+        <w:jc w:val="left"/>
+        <w:rPr/>
+      </w:pPr>
+      <w:r>
+        <w:rPr>
+          <w:rtl w:val="0"/>
+        </w:rPr>
+        <w:t xml:space="preserve"># temperature=0.3 preserved on all agents</w:t>
+      </w:r>
+    </w:p>
+    <w:p>
+      <w:pPr>
+        <w:keepNext w:val="0"/>
+        <w:keepLines w:val="0"/>
+        <w:pageBreakBefore w:val="0"/>
+        <w:widowControl w:val="0"/>
+        <w:pBdr>
+          <w:top w:space="0" w:sz="0" w:val="nil"/>
+          <w:left w:space="0" w:sz="0" w:val="nil"/>
+          <w:bottom w:space="0" w:sz="0" w:val="nil"/>
+          <w:right w:space="0" w:sz="0" w:val="nil"/>
+          <w:between w:space="0" w:sz="0" w:val="nil"/>
+        </w:pBdr>
+        <w:shd w:fill="auto" w:val="clear"/>
+        <w:spacing w:after="0" w:before="0" w:line="276" w:lineRule="auto"/>
+        <w:ind w:left="0" w:right="0" w:firstLine="0"/>
+        <w:jc w:val="left"/>
+        <w:rPr/>
+      </w:pPr>
+      <w:r>
+        <w:rPr>
+          <w:rtl w:val="0"/>
+        </w:rPr>
+      </w:r>
+    </w:p>
+    <w:p>
+      <w:pPr>
+        <w:keepNext w:val="0"/>
+        <w:keepLines w:val="0"/>
+        <w:pageBreakBefore w:val="0"/>
+        <w:widowControl w:val="0"/>
+        <w:pBdr>
+          <w:top w:space="0" w:sz="0" w:val="nil"/>
+          <w:left w:space="0" w:sz="0" w:val="nil"/>
+          <w:bottom w:space="0" w:sz="0" w:val="nil"/>
+          <w:right w:space="0" w:sz="0" w:val="nil"/>
+          <w:between w:space="0" w:sz="0" w:val="nil"/>
+        </w:pBdr>
+        <w:shd w:fill="auto" w:val="clear"/>
+        <w:spacing w:after="0" w:before="0" w:line="276" w:lineRule="auto"/>
+        <w:ind w:left="0" w:right="0" w:firstLine="0"/>
+        <w:jc w:val="left"/>
+        <w:rPr/>
+      </w:pPr>
+      <w:r>
+        <w:rPr>
+          <w:rtl w:val="0"/>
+        </w:rPr>
+        <w:t xml:space="preserve">REGION = 'us-east-1'</w:t>
       </w:r>
     </w:p>
     <w:p>
@@ -397,7 +475,1018 @@
         <w:rPr>
           <w:rtl w:val="0"/>
         </w:rPr>
-        <w:t xml:space="preserve">lambda_client = boto3.client('lambda', region_name='us-east-1')</w:t>
+        <w:t xml:space="preserve"># SQS queue URLs -- derived from confirmed ARNs</w:t>
+      </w:r>
+    </w:p>
+    <w:p>
+      <w:pPr>
+        <w:keepNext w:val="0"/>
+        <w:keepLines w:val="0"/>
+        <w:pageBreakBefore w:val="0"/>
+        <w:widowControl w:val="0"/>
+        <w:pBdr>
+          <w:top w:space="0" w:sz="0" w:val="nil"/>
+          <w:left w:space="0" w:sz="0" w:val="nil"/>
+          <w:bottom w:space="0" w:sz="0" w:val="nil"/>
+          <w:right w:space="0" w:sz="0" w:val="nil"/>
+          <w:between w:space="0" w:sz="0" w:val="nil"/>
+        </w:pBdr>
+        <w:shd w:fill="auto" w:val="clear"/>
+        <w:spacing w:after="0" w:before="0" w:line="276" w:lineRule="auto"/>
+        <w:ind w:left="0" w:right="0" w:firstLine="0"/>
+        <w:jc w:val="left"/>
+        <w:rPr/>
+      </w:pPr>
+      <w:r>
+        <w:rPr>
+          <w:rtl w:val="0"/>
+        </w:rPr>
+        <w:t xml:space="preserve">QUEUE_BASE = 'https://sqs.us-east-1.amazonaws.com/236510207245'</w:t>
+      </w:r>
+    </w:p>
+    <w:p>
+      <w:pPr>
+        <w:keepNext w:val="0"/>
+        <w:keepLines w:val="0"/>
+        <w:pageBreakBefore w:val="0"/>
+        <w:widowControl w:val="0"/>
+        <w:pBdr>
+          <w:top w:space="0" w:sz="0" w:val="nil"/>
+          <w:left w:space="0" w:sz="0" w:val="nil"/>
+          <w:bottom w:space="0" w:sz="0" w:val="nil"/>
+          <w:right w:space="0" w:sz="0" w:val="nil"/>
+          <w:between w:space="0" w:sz="0" w:val="nil"/>
+        </w:pBdr>
+        <w:shd w:fill="auto" w:val="clear"/>
+        <w:spacing w:after="0" w:before="0" w:line="276" w:lineRule="auto"/>
+        <w:ind w:left="0" w:right="0" w:firstLine="0"/>
+        <w:jc w:val="left"/>
+        <w:rPr/>
+      </w:pPr>
+      <w:r>
+        <w:rPr>
+          <w:rtl w:val="0"/>
+        </w:rPr>
+        <w:t xml:space="preserve">Q_MODERATOR = QUEUE_BASE + '/v3r-moderator.fifo'</w:t>
+      </w:r>
+    </w:p>
+    <w:p>
+      <w:pPr>
+        <w:keepNext w:val="0"/>
+        <w:keepLines w:val="0"/>
+        <w:pageBreakBefore w:val="0"/>
+        <w:widowControl w:val="0"/>
+        <w:pBdr>
+          <w:top w:space="0" w:sz="0" w:val="nil"/>
+          <w:left w:space="0" w:sz="0" w:val="nil"/>
+          <w:bottom w:space="0" w:sz="0" w:val="nil"/>
+          <w:right w:space="0" w:sz="0" w:val="nil"/>
+          <w:between w:space="0" w:sz="0" w:val="nil"/>
+        </w:pBdr>
+        <w:shd w:fill="auto" w:val="clear"/>
+        <w:spacing w:after="0" w:before="0" w:line="276" w:lineRule="auto"/>
+        <w:ind w:left="0" w:right="0" w:firstLine="0"/>
+        <w:jc w:val="left"/>
+        <w:rPr/>
+      </w:pPr>
+      <w:r>
+        <w:rPr>
+          <w:rtl w:val="0"/>
+        </w:rPr>
+        <w:t xml:space="preserve">Q_KR = QUEUE_BASE + '/v3r-knowledge-retrieval.fifo'</w:t>
+      </w:r>
+    </w:p>
+    <w:p>
+      <w:pPr>
+        <w:keepNext w:val="0"/>
+        <w:keepLines w:val="0"/>
+        <w:pageBreakBefore w:val="0"/>
+        <w:widowControl w:val="0"/>
+        <w:pBdr>
+          <w:top w:space="0" w:sz="0" w:val="nil"/>
+          <w:left w:space="0" w:sz="0" w:val="nil"/>
+          <w:bottom w:space="0" w:sz="0" w:val="nil"/>
+          <w:right w:space="0" w:sz="0" w:val="nil"/>
+          <w:between w:space="0" w:sz="0" w:val="nil"/>
+        </w:pBdr>
+        <w:shd w:fill="auto" w:val="clear"/>
+        <w:spacing w:after="0" w:before="0" w:line="276" w:lineRule="auto"/>
+        <w:ind w:left="0" w:right="0" w:firstLine="0"/>
+        <w:jc w:val="left"/>
+        <w:rPr/>
+      </w:pPr>
+      <w:r>
+        <w:rPr>
+          <w:rtl w:val="0"/>
+        </w:rPr>
+        <w:t xml:space="preserve">Q_CODER = QUEUE_BASE + '/v3r-coder.fifo'</w:t>
+      </w:r>
+    </w:p>
+    <w:p>
+      <w:pPr>
+        <w:keepNext w:val="0"/>
+        <w:keepLines w:val="0"/>
+        <w:pageBreakBefore w:val="0"/>
+        <w:widowControl w:val="0"/>
+        <w:pBdr>
+          <w:top w:space="0" w:sz="0" w:val="nil"/>
+          <w:left w:space="0" w:sz="0" w:val="nil"/>
+          <w:bottom w:space="0" w:sz="0" w:val="nil"/>
+          <w:right w:space="0" w:sz="0" w:val="nil"/>
+          <w:between w:space="0" w:sz="0" w:val="nil"/>
+        </w:pBdr>
+        <w:shd w:fill="auto" w:val="clear"/>
+        <w:spacing w:after="0" w:before="0" w:line="276" w:lineRule="auto"/>
+        <w:ind w:left="0" w:right="0" w:firstLine="0"/>
+        <w:jc w:val="left"/>
+        <w:rPr/>
+      </w:pPr>
+      <w:r>
+        <w:rPr>
+          <w:rtl w:val="0"/>
+        </w:rPr>
+        <w:t xml:space="preserve">Q_DEBUG = QUEUE_BASE + '/v3r-debug.fifo'</w:t>
+      </w:r>
+    </w:p>
+    <w:p>
+      <w:pPr>
+        <w:keepNext w:val="0"/>
+        <w:keepLines w:val="0"/>
+        <w:pageBreakBefore w:val="0"/>
+        <w:widowControl w:val="0"/>
+        <w:pBdr>
+          <w:top w:space="0" w:sz="0" w:val="nil"/>
+          <w:left w:space="0" w:sz="0" w:val="nil"/>
+          <w:bottom w:space="0" w:sz="0" w:val="nil"/>
+          <w:right w:space="0" w:sz="0" w:val="nil"/>
+          <w:between w:space="0" w:sz="0" w:val="nil"/>
+        </w:pBdr>
+        <w:shd w:fill="auto" w:val="clear"/>
+        <w:spacing w:after="0" w:before="0" w:line="276" w:lineRule="auto"/>
+        <w:ind w:left="0" w:right="0" w:firstLine="0"/>
+        <w:jc w:val="left"/>
+        <w:rPr/>
+      </w:pPr>
+      <w:r>
+        <w:rPr>
+          <w:rtl w:val="0"/>
+        </w:rPr>
+        <w:t xml:space="preserve">Q_DOCUMENTATION = QUEUE_BASE + '/v3r-documentation.fifo'</w:t>
+      </w:r>
+    </w:p>
+    <w:p>
+      <w:pPr>
+        <w:keepNext w:val="0"/>
+        <w:keepLines w:val="0"/>
+        <w:pageBreakBefore w:val="0"/>
+        <w:widowControl w:val="0"/>
+        <w:pBdr>
+          <w:top w:space="0" w:sz="0" w:val="nil"/>
+          <w:left w:space="0" w:sz="0" w:val="nil"/>
+          <w:bottom w:space="0" w:sz="0" w:val="nil"/>
+          <w:right w:space="0" w:sz="0" w:val="nil"/>
+          <w:between w:space="0" w:sz="0" w:val="nil"/>
+        </w:pBdr>
+        <w:shd w:fill="auto" w:val="clear"/>
+        <w:spacing w:after="0" w:before="0" w:line="276" w:lineRule="auto"/>
+        <w:ind w:left="0" w:right="0" w:firstLine="0"/>
+        <w:jc w:val="left"/>
+        <w:rPr/>
+      </w:pPr>
+      <w:r>
+        <w:rPr>
+          <w:rtl w:val="0"/>
+        </w:rPr>
+        <w:t xml:space="preserve">Q_INFRASTRUCTURE = QUEUE_BASE + '/v3r-infrastructure.fifo'</w:t>
+      </w:r>
+    </w:p>
+    <w:p>
+      <w:pPr>
+        <w:keepNext w:val="0"/>
+        <w:keepLines w:val="0"/>
+        <w:pageBreakBefore w:val="0"/>
+        <w:widowControl w:val="0"/>
+        <w:pBdr>
+          <w:top w:space="0" w:sz="0" w:val="nil"/>
+          <w:left w:space="0" w:sz="0" w:val="nil"/>
+          <w:bottom w:space="0" w:sz="0" w:val="nil"/>
+          <w:right w:space="0" w:sz="0" w:val="nil"/>
+          <w:between w:space="0" w:sz="0" w:val="nil"/>
+        </w:pBdr>
+        <w:shd w:fill="auto" w:val="clear"/>
+        <w:spacing w:after="0" w:before="0" w:line="276" w:lineRule="auto"/>
+        <w:ind w:left="0" w:right="0" w:firstLine="0"/>
+        <w:jc w:val="left"/>
+        <w:rPr/>
+      </w:pPr>
+      <w:r>
+        <w:rPr>
+          <w:rtl w:val="0"/>
+        </w:rPr>
+      </w:r>
+    </w:p>
+    <w:p>
+      <w:pPr>
+        <w:keepNext w:val="0"/>
+        <w:keepLines w:val="0"/>
+        <w:pageBreakBefore w:val="0"/>
+        <w:widowControl w:val="0"/>
+        <w:pBdr>
+          <w:top w:space="0" w:sz="0" w:val="nil"/>
+          <w:left w:space="0" w:sz="0" w:val="nil"/>
+          <w:bottom w:space="0" w:sz="0" w:val="nil"/>
+          <w:right w:space="0" w:sz="0" w:val="nil"/>
+          <w:between w:space="0" w:sz="0" w:val="nil"/>
+        </w:pBdr>
+        <w:shd w:fill="auto" w:val="clear"/>
+        <w:spacing w:after="0" w:before="0" w:line="276" w:lineRule="auto"/>
+        <w:ind w:left="0" w:right="0" w:firstLine="0"/>
+        <w:jc w:val="left"/>
+        <w:rPr/>
+      </w:pPr>
+      <w:r>
+        <w:rPr>
+          <w:rtl w:val="0"/>
+        </w:rPr>
+        <w:t xml:space="preserve">lambda_client = boto3.client('lambda', region_name=REGION)</w:t>
+      </w:r>
+    </w:p>
+    <w:p>
+      <w:pPr>
+        <w:keepNext w:val="0"/>
+        <w:keepLines w:val="0"/>
+        <w:pageBreakBefore w:val="0"/>
+        <w:widowControl w:val="0"/>
+        <w:pBdr>
+          <w:top w:space="0" w:sz="0" w:val="nil"/>
+          <w:left w:space="0" w:sz="0" w:val="nil"/>
+          <w:bottom w:space="0" w:sz="0" w:val="nil"/>
+          <w:right w:space="0" w:sz="0" w:val="nil"/>
+          <w:between w:space="0" w:sz="0" w:val="nil"/>
+        </w:pBdr>
+        <w:shd w:fill="auto" w:val="clear"/>
+        <w:spacing w:after="0" w:before="0" w:line="276" w:lineRule="auto"/>
+        <w:ind w:left="0" w:right="0" w:firstLine="0"/>
+        <w:jc w:val="left"/>
+        <w:rPr/>
+      </w:pPr>
+      <w:r>
+        <w:rPr>
+          <w:rtl w:val="0"/>
+        </w:rPr>
+        <w:t xml:space="preserve">sqs_client = boto3.client('sqs', region_name=REGION)</w:t>
+      </w:r>
+    </w:p>
+    <w:p>
+      <w:pPr>
+        <w:keepNext w:val="0"/>
+        <w:keepLines w:val="0"/>
+        <w:pageBreakBefore w:val="0"/>
+        <w:widowControl w:val="0"/>
+        <w:pBdr>
+          <w:top w:space="0" w:sz="0" w:val="nil"/>
+          <w:left w:space="0" w:sz="0" w:val="nil"/>
+          <w:bottom w:space="0" w:sz="0" w:val="nil"/>
+          <w:right w:space="0" w:sz="0" w:val="nil"/>
+          <w:between w:space="0" w:sz="0" w:val="nil"/>
+        </w:pBdr>
+        <w:shd w:fill="auto" w:val="clear"/>
+        <w:spacing w:after="0" w:before="0" w:line="276" w:lineRule="auto"/>
+        <w:ind w:left="0" w:right="0" w:firstLine="0"/>
+        <w:jc w:val="left"/>
+        <w:rPr/>
+      </w:pPr>
+      <w:r>
+        <w:rPr>
+          <w:rtl w:val="0"/>
+        </w:rPr>
+      </w:r>
+    </w:p>
+    <w:p>
+      <w:pPr>
+        <w:keepNext w:val="0"/>
+        <w:keepLines w:val="0"/>
+        <w:pageBreakBefore w:val="0"/>
+        <w:widowControl w:val="0"/>
+        <w:pBdr>
+          <w:top w:space="0" w:sz="0" w:val="nil"/>
+          <w:left w:space="0" w:sz="0" w:val="nil"/>
+          <w:bottom w:space="0" w:sz="0" w:val="nil"/>
+          <w:right w:space="0" w:sz="0" w:val="nil"/>
+          <w:between w:space="0" w:sz="0" w:val="nil"/>
+        </w:pBdr>
+        <w:shd w:fill="auto" w:val="clear"/>
+        <w:spacing w:after="0" w:before="0" w:line="276" w:lineRule="auto"/>
+        <w:ind w:left="0" w:right="0" w:firstLine="0"/>
+        <w:jc w:val="left"/>
+        <w:rPr/>
+      </w:pPr>
+      <w:r>
+        <w:rPr>
+          <w:rtl w:val="0"/>
+        </w:rPr>
+        <w:t xml:space="preserve">def sqs_send(queue_url, payload, group_id='v3r-pipeline'):</w:t>
+      </w:r>
+    </w:p>
+    <w:p>
+      <w:pPr>
+        <w:keepNext w:val="0"/>
+        <w:keepLines w:val="0"/>
+        <w:pageBreakBefore w:val="0"/>
+        <w:widowControl w:val="0"/>
+        <w:pBdr>
+          <w:top w:space="0" w:sz="0" w:val="nil"/>
+          <w:left w:space="0" w:sz="0" w:val="nil"/>
+          <w:bottom w:space="0" w:sz="0" w:val="nil"/>
+          <w:right w:space="0" w:sz="0" w:val="nil"/>
+          <w:between w:space="0" w:sz="0" w:val="nil"/>
+        </w:pBdr>
+        <w:shd w:fill="auto" w:val="clear"/>
+        <w:spacing w:after="0" w:before="0" w:line="276" w:lineRule="auto"/>
+        <w:ind w:left="0" w:right="0" w:firstLine="0"/>
+        <w:jc w:val="left"/>
+        <w:rPr/>
+      </w:pPr>
+      <w:r>
+        <w:rPr>
+          <w:rtl w:val="0"/>
+        </w:rPr>
+        <w:t xml:space="preserve">    # Send message to SQS FIFO queue</w:t>
+      </w:r>
+    </w:p>
+    <w:p>
+      <w:pPr>
+        <w:keepNext w:val="0"/>
+        <w:keepLines w:val="0"/>
+        <w:pageBreakBefore w:val="0"/>
+        <w:widowControl w:val="0"/>
+        <w:pBdr>
+          <w:top w:space="0" w:sz="0" w:val="nil"/>
+          <w:left w:space="0" w:sz="0" w:val="nil"/>
+          <w:bottom w:space="0" w:sz="0" w:val="nil"/>
+          <w:right w:space="0" w:sz="0" w:val="nil"/>
+          <w:between w:space="0" w:sz="0" w:val="nil"/>
+        </w:pBdr>
+        <w:shd w:fill="auto" w:val="clear"/>
+        <w:spacing w:after="0" w:before="0" w:line="276" w:lineRule="auto"/>
+        <w:ind w:left="0" w:right="0" w:firstLine="0"/>
+        <w:jc w:val="left"/>
+        <w:rPr/>
+      </w:pPr>
+      <w:r>
+        <w:rPr>
+          <w:rtl w:val="0"/>
+        </w:rPr>
+        <w:t xml:space="preserve">    # ContentBasedDeduplication enabled on queues -- no dedup ID needed</w:t>
+      </w:r>
+    </w:p>
+    <w:p>
+      <w:pPr>
+        <w:keepNext w:val="0"/>
+        <w:keepLines w:val="0"/>
+        <w:pageBreakBefore w:val="0"/>
+        <w:widowControl w:val="0"/>
+        <w:pBdr>
+          <w:top w:space="0" w:sz="0" w:val="nil"/>
+          <w:left w:space="0" w:sz="0" w:val="nil"/>
+          <w:bottom w:space="0" w:sz="0" w:val="nil"/>
+          <w:right w:space="0" w:sz="0" w:val="nil"/>
+          <w:between w:space="0" w:sz="0" w:val="nil"/>
+        </w:pBdr>
+        <w:shd w:fill="auto" w:val="clear"/>
+        <w:spacing w:after="0" w:before="0" w:line="276" w:lineRule="auto"/>
+        <w:ind w:left="0" w:right="0" w:firstLine="0"/>
+        <w:jc w:val="left"/>
+        <w:rPr/>
+      </w:pPr>
+      <w:r>
+        <w:rPr>
+          <w:rtl w:val="0"/>
+        </w:rPr>
+        <w:t xml:space="preserve">    sqs_client.send_message(</w:t>
+      </w:r>
+    </w:p>
+    <w:p>
+      <w:pPr>
+        <w:keepNext w:val="0"/>
+        <w:keepLines w:val="0"/>
+        <w:pageBreakBefore w:val="0"/>
+        <w:widowControl w:val="0"/>
+        <w:pBdr>
+          <w:top w:space="0" w:sz="0" w:val="nil"/>
+          <w:left w:space="0" w:sz="0" w:val="nil"/>
+          <w:bottom w:space="0" w:sz="0" w:val="nil"/>
+          <w:right w:space="0" w:sz="0" w:val="nil"/>
+          <w:between w:space="0" w:sz="0" w:val="nil"/>
+        </w:pBdr>
+        <w:shd w:fill="auto" w:val="clear"/>
+        <w:spacing w:after="0" w:before="0" w:line="276" w:lineRule="auto"/>
+        <w:ind w:left="0" w:right="0" w:firstLine="0"/>
+        <w:jc w:val="left"/>
+        <w:rPr/>
+      </w:pPr>
+      <w:r>
+        <w:rPr>
+          <w:rtl w:val="0"/>
+        </w:rPr>
+        <w:t xml:space="preserve">        QueueUrl=queue_url,</w:t>
+      </w:r>
+    </w:p>
+    <w:p>
+      <w:pPr>
+        <w:keepNext w:val="0"/>
+        <w:keepLines w:val="0"/>
+        <w:pageBreakBefore w:val="0"/>
+        <w:widowControl w:val="0"/>
+        <w:pBdr>
+          <w:top w:space="0" w:sz="0" w:val="nil"/>
+          <w:left w:space="0" w:sz="0" w:val="nil"/>
+          <w:bottom w:space="0" w:sz="0" w:val="nil"/>
+          <w:right w:space="0" w:sz="0" w:val="nil"/>
+          <w:between w:space="0" w:sz="0" w:val="nil"/>
+        </w:pBdr>
+        <w:shd w:fill="auto" w:val="clear"/>
+        <w:spacing w:after="0" w:before="0" w:line="276" w:lineRule="auto"/>
+        <w:ind w:left="0" w:right="0" w:firstLine="0"/>
+        <w:jc w:val="left"/>
+        <w:rPr/>
+      </w:pPr>
+      <w:r>
+        <w:rPr>
+          <w:rtl w:val="0"/>
+        </w:rPr>
+        <w:t xml:space="preserve">        MessageBody=json.dumps(payload),</w:t>
+      </w:r>
+    </w:p>
+    <w:p>
+      <w:pPr>
+        <w:keepNext w:val="0"/>
+        <w:keepLines w:val="0"/>
+        <w:pageBreakBefore w:val="0"/>
+        <w:widowControl w:val="0"/>
+        <w:pBdr>
+          <w:top w:space="0" w:sz="0" w:val="nil"/>
+          <w:left w:space="0" w:sz="0" w:val="nil"/>
+          <w:bottom w:space="0" w:sz="0" w:val="nil"/>
+          <w:right w:space="0" w:sz="0" w:val="nil"/>
+          <w:between w:space="0" w:sz="0" w:val="nil"/>
+        </w:pBdr>
+        <w:shd w:fill="auto" w:val="clear"/>
+        <w:spacing w:after="0" w:before="0" w:line="276" w:lineRule="auto"/>
+        <w:ind w:left="0" w:right="0" w:firstLine="0"/>
+        <w:jc w:val="left"/>
+        <w:rPr/>
+      </w:pPr>
+      <w:r>
+        <w:rPr>
+          <w:rtl w:val="0"/>
+        </w:rPr>
+        <w:t xml:space="preserve">        MessageGroupId=group_id</w:t>
+      </w:r>
+    </w:p>
+    <w:p>
+      <w:pPr>
+        <w:keepNext w:val="0"/>
+        <w:keepLines w:val="0"/>
+        <w:pageBreakBefore w:val="0"/>
+        <w:widowControl w:val="0"/>
+        <w:pBdr>
+          <w:top w:space="0" w:sz="0" w:val="nil"/>
+          <w:left w:space="0" w:sz="0" w:val="nil"/>
+          <w:bottom w:space="0" w:sz="0" w:val="nil"/>
+          <w:right w:space="0" w:sz="0" w:val="nil"/>
+          <w:between w:space="0" w:sz="0" w:val="nil"/>
+        </w:pBdr>
+        <w:shd w:fill="auto" w:val="clear"/>
+        <w:spacing w:after="0" w:before="0" w:line="276" w:lineRule="auto"/>
+        <w:ind w:left="0" w:right="0" w:firstLine="0"/>
+        <w:jc w:val="left"/>
+        <w:rPr/>
+      </w:pPr>
+      <w:r>
+        <w:rPr>
+          <w:rtl w:val="0"/>
+        </w:rPr>
+        <w:t xml:space="preserve">    )</w:t>
+      </w:r>
+    </w:p>
+    <w:p>
+      <w:pPr>
+        <w:keepNext w:val="0"/>
+        <w:keepLines w:val="0"/>
+        <w:pageBreakBefore w:val="0"/>
+        <w:widowControl w:val="0"/>
+        <w:pBdr>
+          <w:top w:space="0" w:sz="0" w:val="nil"/>
+          <w:left w:space="0" w:sz="0" w:val="nil"/>
+          <w:bottom w:space="0" w:sz="0" w:val="nil"/>
+          <w:right w:space="0" w:sz="0" w:val="nil"/>
+          <w:between w:space="0" w:sz="0" w:val="nil"/>
+        </w:pBdr>
+        <w:shd w:fill="auto" w:val="clear"/>
+        <w:spacing w:after="0" w:before="0" w:line="276" w:lineRule="auto"/>
+        <w:ind w:left="0" w:right="0" w:firstLine="0"/>
+        <w:jc w:val="left"/>
+        <w:rPr/>
+      </w:pPr>
+      <w:r>
+        <w:rPr>
+          <w:rtl w:val="0"/>
+        </w:rPr>
+      </w:r>
+    </w:p>
+    <w:p>
+      <w:pPr>
+        <w:keepNext w:val="0"/>
+        <w:keepLines w:val="0"/>
+        <w:pageBreakBefore w:val="0"/>
+        <w:widowControl w:val="0"/>
+        <w:pBdr>
+          <w:top w:space="0" w:sz="0" w:val="nil"/>
+          <w:left w:space="0" w:sz="0" w:val="nil"/>
+          <w:bottom w:space="0" w:sz="0" w:val="nil"/>
+          <w:right w:space="0" w:sz="0" w:val="nil"/>
+          <w:between w:space="0" w:sz="0" w:val="nil"/>
+        </w:pBdr>
+        <w:shd w:fill="auto" w:val="clear"/>
+        <w:spacing w:after="0" w:before="0" w:line="276" w:lineRule="auto"/>
+        <w:ind w:left="0" w:right="0" w:firstLine="0"/>
+        <w:jc w:val="left"/>
+        <w:rPr/>
+      </w:pPr>
+      <w:r>
+        <w:rPr>
+          <w:rtl w:val="0"/>
+        </w:rPr>
+        <w:t xml:space="preserve">def sqs_poll(queue_url, wait_seconds=20):</w:t>
+      </w:r>
+    </w:p>
+    <w:p>
+      <w:pPr>
+        <w:keepNext w:val="0"/>
+        <w:keepLines w:val="0"/>
+        <w:pageBreakBefore w:val="0"/>
+        <w:widowControl w:val="0"/>
+        <w:pBdr>
+          <w:top w:space="0" w:sz="0" w:val="nil"/>
+          <w:left w:space="0" w:sz="0" w:val="nil"/>
+          <w:bottom w:space="0" w:sz="0" w:val="nil"/>
+          <w:right w:space="0" w:sz="0" w:val="nil"/>
+          <w:between w:space="0" w:sz="0" w:val="nil"/>
+        </w:pBdr>
+        <w:shd w:fill="auto" w:val="clear"/>
+        <w:spacing w:after="0" w:before="0" w:line="276" w:lineRule="auto"/>
+        <w:ind w:left="0" w:right="0" w:firstLine="0"/>
+        <w:jc w:val="left"/>
+        <w:rPr/>
+      </w:pPr>
+      <w:r>
+        <w:rPr>
+          <w:rtl w:val="0"/>
+        </w:rPr>
+        <w:t xml:space="preserve">    # Long-poll SQS queue for response -- returns message body or None</w:t>
+      </w:r>
+    </w:p>
+    <w:p>
+      <w:pPr>
+        <w:keepNext w:val="0"/>
+        <w:keepLines w:val="0"/>
+        <w:pageBreakBefore w:val="0"/>
+        <w:widowControl w:val="0"/>
+        <w:pBdr>
+          <w:top w:space="0" w:sz="0" w:val="nil"/>
+          <w:left w:space="0" w:sz="0" w:val="nil"/>
+          <w:bottom w:space="0" w:sz="0" w:val="nil"/>
+          <w:right w:space="0" w:sz="0" w:val="nil"/>
+          <w:between w:space="0" w:sz="0" w:val="nil"/>
+        </w:pBdr>
+        <w:shd w:fill="auto" w:val="clear"/>
+        <w:spacing w:after="0" w:before="0" w:line="276" w:lineRule="auto"/>
+        <w:ind w:left="0" w:right="0" w:firstLine="0"/>
+        <w:jc w:val="left"/>
+        <w:rPr/>
+      </w:pPr>
+      <w:r>
+        <w:rPr>
+          <w:rtl w:val="0"/>
+        </w:rPr>
+        <w:t xml:space="preserve">    # wait_seconds=20 is max long-poll -- reduces empty receives</w:t>
+      </w:r>
+    </w:p>
+    <w:p>
+      <w:pPr>
+        <w:keepNext w:val="0"/>
+        <w:keepLines w:val="0"/>
+        <w:pageBreakBefore w:val="0"/>
+        <w:widowControl w:val="0"/>
+        <w:pBdr>
+          <w:top w:space="0" w:sz="0" w:val="nil"/>
+          <w:left w:space="0" w:sz="0" w:val="nil"/>
+          <w:bottom w:space="0" w:sz="0" w:val="nil"/>
+          <w:right w:space="0" w:sz="0" w:val="nil"/>
+          <w:between w:space="0" w:sz="0" w:val="nil"/>
+        </w:pBdr>
+        <w:shd w:fill="auto" w:val="clear"/>
+        <w:spacing w:after="0" w:before="0" w:line="276" w:lineRule="auto"/>
+        <w:ind w:left="0" w:right="0" w:firstLine="0"/>
+        <w:jc w:val="left"/>
+        <w:rPr/>
+      </w:pPr>
+      <w:r>
+        <w:rPr>
+          <w:rtl w:val="0"/>
+        </w:rPr>
+        <w:t xml:space="preserve">    resp = sqs_client.receive_message(</w:t>
+      </w:r>
+    </w:p>
+    <w:p>
+      <w:pPr>
+        <w:keepNext w:val="0"/>
+        <w:keepLines w:val="0"/>
+        <w:pageBreakBefore w:val="0"/>
+        <w:widowControl w:val="0"/>
+        <w:pBdr>
+          <w:top w:space="0" w:sz="0" w:val="nil"/>
+          <w:left w:space="0" w:sz="0" w:val="nil"/>
+          <w:bottom w:space="0" w:sz="0" w:val="nil"/>
+          <w:right w:space="0" w:sz="0" w:val="nil"/>
+          <w:between w:space="0" w:sz="0" w:val="nil"/>
+        </w:pBdr>
+        <w:shd w:fill="auto" w:val="clear"/>
+        <w:spacing w:after="0" w:before="0" w:line="276" w:lineRule="auto"/>
+        <w:ind w:left="0" w:right="0" w:firstLine="0"/>
+        <w:jc w:val="left"/>
+        <w:rPr/>
+      </w:pPr>
+      <w:r>
+        <w:rPr>
+          <w:rtl w:val="0"/>
+        </w:rPr>
+        <w:t xml:space="preserve">        QueueUrl=queue_url,</w:t>
+      </w:r>
+    </w:p>
+    <w:p>
+      <w:pPr>
+        <w:keepNext w:val="0"/>
+        <w:keepLines w:val="0"/>
+        <w:pageBreakBefore w:val="0"/>
+        <w:widowControl w:val="0"/>
+        <w:pBdr>
+          <w:top w:space="0" w:sz="0" w:val="nil"/>
+          <w:left w:space="0" w:sz="0" w:val="nil"/>
+          <w:bottom w:space="0" w:sz="0" w:val="nil"/>
+          <w:right w:space="0" w:sz="0" w:val="nil"/>
+          <w:between w:space="0" w:sz="0" w:val="nil"/>
+        </w:pBdr>
+        <w:shd w:fill="auto" w:val="clear"/>
+        <w:spacing w:after="0" w:before="0" w:line="276" w:lineRule="auto"/>
+        <w:ind w:left="0" w:right="0" w:firstLine="0"/>
+        <w:jc w:val="left"/>
+        <w:rPr/>
+      </w:pPr>
+      <w:r>
+        <w:rPr>
+          <w:rtl w:val="0"/>
+        </w:rPr>
+        <w:t xml:space="preserve">        MaxNumberOfMessages=1,</w:t>
+      </w:r>
+    </w:p>
+    <w:p>
+      <w:pPr>
+        <w:keepNext w:val="0"/>
+        <w:keepLines w:val="0"/>
+        <w:pageBreakBefore w:val="0"/>
+        <w:widowControl w:val="0"/>
+        <w:pBdr>
+          <w:top w:space="0" w:sz="0" w:val="nil"/>
+          <w:left w:space="0" w:sz="0" w:val="nil"/>
+          <w:bottom w:space="0" w:sz="0" w:val="nil"/>
+          <w:right w:space="0" w:sz="0" w:val="nil"/>
+          <w:between w:space="0" w:sz="0" w:val="nil"/>
+        </w:pBdr>
+        <w:shd w:fill="auto" w:val="clear"/>
+        <w:spacing w:after="0" w:before="0" w:line="276" w:lineRule="auto"/>
+        <w:ind w:left="0" w:right="0" w:firstLine="0"/>
+        <w:jc w:val="left"/>
+        <w:rPr/>
+      </w:pPr>
+      <w:r>
+        <w:rPr>
+          <w:rtl w:val="0"/>
+        </w:rPr>
+        <w:t xml:space="preserve">        WaitTimeSeconds=wait_seconds,</w:t>
+      </w:r>
+    </w:p>
+    <w:p>
+      <w:pPr>
+        <w:keepNext w:val="0"/>
+        <w:keepLines w:val="0"/>
+        <w:pageBreakBefore w:val="0"/>
+        <w:widowControl w:val="0"/>
+        <w:pBdr>
+          <w:top w:space="0" w:sz="0" w:val="nil"/>
+          <w:left w:space="0" w:sz="0" w:val="nil"/>
+          <w:bottom w:space="0" w:sz="0" w:val="nil"/>
+          <w:right w:space="0" w:sz="0" w:val="nil"/>
+          <w:between w:space="0" w:sz="0" w:val="nil"/>
+        </w:pBdr>
+        <w:shd w:fill="auto" w:val="clear"/>
+        <w:spacing w:after="0" w:before="0" w:line="276" w:lineRule="auto"/>
+        <w:ind w:left="0" w:right="0" w:firstLine="0"/>
+        <w:jc w:val="left"/>
+        <w:rPr/>
+      </w:pPr>
+      <w:r>
+        <w:rPr>
+          <w:rtl w:val="0"/>
+        </w:rPr>
+        <w:t xml:space="preserve">        VisibilityTimeout=300</w:t>
+      </w:r>
+    </w:p>
+    <w:p>
+      <w:pPr>
+        <w:keepNext w:val="0"/>
+        <w:keepLines w:val="0"/>
+        <w:pageBreakBefore w:val="0"/>
+        <w:widowControl w:val="0"/>
+        <w:pBdr>
+          <w:top w:space="0" w:sz="0" w:val="nil"/>
+          <w:left w:space="0" w:sz="0" w:val="nil"/>
+          <w:bottom w:space="0" w:sz="0" w:val="nil"/>
+          <w:right w:space="0" w:sz="0" w:val="nil"/>
+          <w:between w:space="0" w:sz="0" w:val="nil"/>
+        </w:pBdr>
+        <w:shd w:fill="auto" w:val="clear"/>
+        <w:spacing w:after="0" w:before="0" w:line="276" w:lineRule="auto"/>
+        <w:ind w:left="0" w:right="0" w:firstLine="0"/>
+        <w:jc w:val="left"/>
+        <w:rPr/>
+      </w:pPr>
+      <w:r>
+        <w:rPr>
+          <w:rtl w:val="0"/>
+        </w:rPr>
+        <w:t xml:space="preserve">    )</w:t>
+      </w:r>
+    </w:p>
+    <w:p>
+      <w:pPr>
+        <w:keepNext w:val="0"/>
+        <w:keepLines w:val="0"/>
+        <w:pageBreakBefore w:val="0"/>
+        <w:widowControl w:val="0"/>
+        <w:pBdr>
+          <w:top w:space="0" w:sz="0" w:val="nil"/>
+          <w:left w:space="0" w:sz="0" w:val="nil"/>
+          <w:bottom w:space="0" w:sz="0" w:val="nil"/>
+          <w:right w:space="0" w:sz="0" w:val="nil"/>
+          <w:between w:space="0" w:sz="0" w:val="nil"/>
+        </w:pBdr>
+        <w:shd w:fill="auto" w:val="clear"/>
+        <w:spacing w:after="0" w:before="0" w:line="276" w:lineRule="auto"/>
+        <w:ind w:left="0" w:right="0" w:firstLine="0"/>
+        <w:jc w:val="left"/>
+        <w:rPr/>
+      </w:pPr>
+      <w:r>
+        <w:rPr>
+          <w:rtl w:val="0"/>
+        </w:rPr>
+        <w:t xml:space="preserve">    messages = resp.get('Messages', [])</w:t>
+      </w:r>
+    </w:p>
+    <w:p>
+      <w:pPr>
+        <w:keepNext w:val="0"/>
+        <w:keepLines w:val="0"/>
+        <w:pageBreakBefore w:val="0"/>
+        <w:widowControl w:val="0"/>
+        <w:pBdr>
+          <w:top w:space="0" w:sz="0" w:val="nil"/>
+          <w:left w:space="0" w:sz="0" w:val="nil"/>
+          <w:bottom w:space="0" w:sz="0" w:val="nil"/>
+          <w:right w:space="0" w:sz="0" w:val="nil"/>
+          <w:between w:space="0" w:sz="0" w:val="nil"/>
+        </w:pBdr>
+        <w:shd w:fill="auto" w:val="clear"/>
+        <w:spacing w:after="0" w:before="0" w:line="276" w:lineRule="auto"/>
+        <w:ind w:left="0" w:right="0" w:firstLine="0"/>
+        <w:jc w:val="left"/>
+        <w:rPr/>
+      </w:pPr>
+      <w:r>
+        <w:rPr>
+          <w:rtl w:val="0"/>
+        </w:rPr>
+        <w:t xml:space="preserve">    if not messages:</w:t>
+      </w:r>
+    </w:p>
+    <w:p>
+      <w:pPr>
+        <w:keepNext w:val="0"/>
+        <w:keepLines w:val="0"/>
+        <w:pageBreakBefore w:val="0"/>
+        <w:widowControl w:val="0"/>
+        <w:pBdr>
+          <w:top w:space="0" w:sz="0" w:val="nil"/>
+          <w:left w:space="0" w:sz="0" w:val="nil"/>
+          <w:bottom w:space="0" w:sz="0" w:val="nil"/>
+          <w:right w:space="0" w:sz="0" w:val="nil"/>
+          <w:between w:space="0" w:sz="0" w:val="nil"/>
+        </w:pBdr>
+        <w:shd w:fill="auto" w:val="clear"/>
+        <w:spacing w:after="0" w:before="0" w:line="276" w:lineRule="auto"/>
+        <w:ind w:left="0" w:right="0" w:firstLine="0"/>
+        <w:jc w:val="left"/>
+        <w:rPr/>
+      </w:pPr>
+      <w:r>
+        <w:rPr>
+          <w:rtl w:val="0"/>
+        </w:rPr>
+        <w:t xml:space="preserve">        return None</w:t>
+      </w:r>
+    </w:p>
+    <w:p>
+      <w:pPr>
+        <w:keepNext w:val="0"/>
+        <w:keepLines w:val="0"/>
+        <w:pageBreakBefore w:val="0"/>
+        <w:widowControl w:val="0"/>
+        <w:pBdr>
+          <w:top w:space="0" w:sz="0" w:val="nil"/>
+          <w:left w:space="0" w:sz="0" w:val="nil"/>
+          <w:bottom w:space="0" w:sz="0" w:val="nil"/>
+          <w:right w:space="0" w:sz="0" w:val="nil"/>
+          <w:between w:space="0" w:sz="0" w:val="nil"/>
+        </w:pBdr>
+        <w:shd w:fill="auto" w:val="clear"/>
+        <w:spacing w:after="0" w:before="0" w:line="276" w:lineRule="auto"/>
+        <w:ind w:left="0" w:right="0" w:firstLine="0"/>
+        <w:jc w:val="left"/>
+        <w:rPr/>
+      </w:pPr>
+      <w:r>
+        <w:rPr>
+          <w:rtl w:val="0"/>
+        </w:rPr>
+        <w:t xml:space="preserve">    msg = messages[0]</w:t>
+      </w:r>
+    </w:p>
+    <w:p>
+      <w:pPr>
+        <w:keepNext w:val="0"/>
+        <w:keepLines w:val="0"/>
+        <w:pageBreakBefore w:val="0"/>
+        <w:widowControl w:val="0"/>
+        <w:pBdr>
+          <w:top w:space="0" w:sz="0" w:val="nil"/>
+          <w:left w:space="0" w:sz="0" w:val="nil"/>
+          <w:bottom w:space="0" w:sz="0" w:val="nil"/>
+          <w:right w:space="0" w:sz="0" w:val="nil"/>
+          <w:between w:space="0" w:sz="0" w:val="nil"/>
+        </w:pBdr>
+        <w:shd w:fill="auto" w:val="clear"/>
+        <w:spacing w:after="0" w:before="0" w:line="276" w:lineRule="auto"/>
+        <w:ind w:left="0" w:right="0" w:firstLine="0"/>
+        <w:jc w:val="left"/>
+        <w:rPr/>
+      </w:pPr>
+      <w:r>
+        <w:rPr>
+          <w:rtl w:val="0"/>
+        </w:rPr>
+        <w:t xml:space="preserve">    # Delete message after receipt -- processed exactly once</w:t>
+      </w:r>
+    </w:p>
+    <w:p>
+      <w:pPr>
+        <w:keepNext w:val="0"/>
+        <w:keepLines w:val="0"/>
+        <w:pageBreakBefore w:val="0"/>
+        <w:widowControl w:val="0"/>
+        <w:pBdr>
+          <w:top w:space="0" w:sz="0" w:val="nil"/>
+          <w:left w:space="0" w:sz="0" w:val="nil"/>
+          <w:bottom w:space="0" w:sz="0" w:val="nil"/>
+          <w:right w:space="0" w:sz="0" w:val="nil"/>
+          <w:between w:space="0" w:sz="0" w:val="nil"/>
+        </w:pBdr>
+        <w:shd w:fill="auto" w:val="clear"/>
+        <w:spacing w:after="0" w:before="0" w:line="276" w:lineRule="auto"/>
+        <w:ind w:left="0" w:right="0" w:firstLine="0"/>
+        <w:jc w:val="left"/>
+        <w:rPr/>
+      </w:pPr>
+      <w:r>
+        <w:rPr>
+          <w:rtl w:val="0"/>
+        </w:rPr>
+        <w:t xml:space="preserve">    sqs_client.delete_message(</w:t>
+      </w:r>
+    </w:p>
+    <w:p>
+      <w:pPr>
+        <w:keepNext w:val="0"/>
+        <w:keepLines w:val="0"/>
+        <w:pageBreakBefore w:val="0"/>
+        <w:widowControl w:val="0"/>
+        <w:pBdr>
+          <w:top w:space="0" w:sz="0" w:val="nil"/>
+          <w:left w:space="0" w:sz="0" w:val="nil"/>
+          <w:bottom w:space="0" w:sz="0" w:val="nil"/>
+          <w:right w:space="0" w:sz="0" w:val="nil"/>
+          <w:between w:space="0" w:sz="0" w:val="nil"/>
+        </w:pBdr>
+        <w:shd w:fill="auto" w:val="clear"/>
+        <w:spacing w:after="0" w:before="0" w:line="276" w:lineRule="auto"/>
+        <w:ind w:left="0" w:right="0" w:firstLine="0"/>
+        <w:jc w:val="left"/>
+        <w:rPr/>
+      </w:pPr>
+      <w:r>
+        <w:rPr>
+          <w:rtl w:val="0"/>
+        </w:rPr>
+        <w:t xml:space="preserve">        QueueUrl=queue_url,</w:t>
+      </w:r>
+    </w:p>
+    <w:p>
+      <w:pPr>
+        <w:keepNext w:val="0"/>
+        <w:keepLines w:val="0"/>
+        <w:pageBreakBefore w:val="0"/>
+        <w:widowControl w:val="0"/>
+        <w:pBdr>
+          <w:top w:space="0" w:sz="0" w:val="nil"/>
+          <w:left w:space="0" w:sz="0" w:val="nil"/>
+          <w:bottom w:space="0" w:sz="0" w:val="nil"/>
+          <w:right w:space="0" w:sz="0" w:val="nil"/>
+          <w:between w:space="0" w:sz="0" w:val="nil"/>
+        </w:pBdr>
+        <w:shd w:fill="auto" w:val="clear"/>
+        <w:spacing w:after="0" w:before="0" w:line="276" w:lineRule="auto"/>
+        <w:ind w:left="0" w:right="0" w:firstLine="0"/>
+        <w:jc w:val="left"/>
+        <w:rPr/>
+      </w:pPr>
+      <w:r>
+        <w:rPr>
+          <w:rtl w:val="0"/>
+        </w:rPr>
+        <w:t xml:space="preserve">        ReceiptHandle=msg['ReceiptHandle']</w:t>
+      </w:r>
+    </w:p>
+    <w:p>
+      <w:pPr>
+        <w:keepNext w:val="0"/>
+        <w:keepLines w:val="0"/>
+        <w:pageBreakBefore w:val="0"/>
+        <w:widowControl w:val="0"/>
+        <w:pBdr>
+          <w:top w:space="0" w:sz="0" w:val="nil"/>
+          <w:left w:space="0" w:sz="0" w:val="nil"/>
+          <w:bottom w:space="0" w:sz="0" w:val="nil"/>
+          <w:right w:space="0" w:sz="0" w:val="nil"/>
+          <w:between w:space="0" w:sz="0" w:val="nil"/>
+        </w:pBdr>
+        <w:shd w:fill="auto" w:val="clear"/>
+        <w:spacing w:after="0" w:before="0" w:line="276" w:lineRule="auto"/>
+        <w:ind w:left="0" w:right="0" w:firstLine="0"/>
+        <w:jc w:val="left"/>
+        <w:rPr/>
+      </w:pPr>
+      <w:r>
+        <w:rPr>
+          <w:rtl w:val="0"/>
+        </w:rPr>
+        <w:t xml:space="preserve">    )</w:t>
+      </w:r>
+    </w:p>
+    <w:p>
+      <w:pPr>
+        <w:keepNext w:val="0"/>
+        <w:keepLines w:val="0"/>
+        <w:pageBreakBefore w:val="0"/>
+        <w:widowControl w:val="0"/>
+        <w:pBdr>
+          <w:top w:space="0" w:sz="0" w:val="nil"/>
+          <w:left w:space="0" w:sz="0" w:val="nil"/>
+          <w:bottom w:space="0" w:sz="0" w:val="nil"/>
+          <w:right w:space="0" w:sz="0" w:val="nil"/>
+          <w:between w:space="0" w:sz="0" w:val="nil"/>
+        </w:pBdr>
+        <w:shd w:fill="auto" w:val="clear"/>
+        <w:spacing w:after="0" w:before="0" w:line="276" w:lineRule="auto"/>
+        <w:ind w:left="0" w:right="0" w:firstLine="0"/>
+        <w:jc w:val="left"/>
+        <w:rPr/>
+      </w:pPr>
+      <w:r>
+        <w:rPr>
+          <w:rtl w:val="0"/>
+        </w:rPr>
+        <w:t xml:space="preserve">    return json.loads(msg['Body'])</w:t>
       </w:r>
     </w:p>
     <w:p>
@@ -474,7 +1563,7 @@
         <w:rPr>
           <w:rtl w:val="0"/>
         </w:rPr>
-        <w:t xml:space="preserve">    system = f'You are the MODERATOR agent of V3R. V3R self-knowledge -- RAG: {rag_context} GRAPH: {graph_context} Decompose this task into RETRIEVAL, OUTPUT, and VALIDATION sections. Be precise and platform-aware.'</w:t>
+        <w:t xml:space="preserve">    system = 'You are the MODERATOR agent of V3R. V3R self-knowledge -- RAG: ' + rag_context + ' GRAPH: ' + graph_context + ' Decompose this task into RETRIEVAL, OUTPUT, and VALIDATION sections. Be precise and platform-aware.'</w:t>
       </w:r>
     </w:p>
     <w:p>
@@ -577,33 +1666,33 @@
         <w:rPr>
           <w:rtl w:val="0"/>
         </w:rPr>
-        <w:t xml:space="preserve">    system = 'You are a knowledge retrieval specialist. Your only job is to surface accurate, version-specific, constraint-aware information. No speculation. No generalization. Cite only what you know with confidence. Flag anything uncertain. Platform constraints: AWS Lambda python:3.12, Linux x86_64, free tier only, Groq llama-3.1-8b-instant, DynamoDB PAY_PER_REQUEST.'</w:t>
-      </w:r>
-    </w:p>
-    <w:p>
-      <w:pPr>
-        <w:keepNext w:val="0"/>
-        <w:keepLines w:val="0"/>
-        <w:pageBreakBefore w:val="0"/>
-        <w:widowControl w:val="0"/>
-        <w:pBdr>
-          <w:top w:space="0" w:sz="0" w:val="nil"/>
-          <w:left w:space="0" w:sz="0" w:val="nil"/>
-          <w:bottom w:space="0" w:sz="0" w:val="nil"/>
-          <w:right w:space="0" w:sz="0" w:val="nil"/>
-          <w:between w:space="0" w:sz="0" w:val="nil"/>
-        </w:pBdr>
-        <w:shd w:fill="auto" w:val="clear"/>
-        <w:spacing w:after="0" w:before="0" w:line="276" w:lineRule="auto"/>
-        <w:ind w:left="0" w:right="0" w:firstLine="0"/>
-        <w:jc w:val="left"/>
-        <w:rPr/>
-      </w:pPr>
-      <w:r>
-        <w:rPr>
-          <w:rtl w:val="0"/>
-        </w:rPr>
-        <w:t xml:space="preserve">    content = f'Retrieval task: {retrieval_task}\n\nRAG context: {rag_context}\n\nGraph context: {graph_context}'</w:t>
+        <w:t xml:space="preserve">    system = 'You are a knowledge retrieval specialist. Your only job is to surface accurate, version-specific, constraint-aware information. No speculation. No generalization. Cite only what you know with confidence. Flag anything uncertain. Platform constraints: AWS Lambda python:3.12, Linux x86_64, free tier only, DynamoDB PAY_PER_REQUEST.'</w:t>
+      </w:r>
+    </w:p>
+    <w:p>
+      <w:pPr>
+        <w:keepNext w:val="0"/>
+        <w:keepLines w:val="0"/>
+        <w:pageBreakBefore w:val="0"/>
+        <w:widowControl w:val="0"/>
+        <w:pBdr>
+          <w:top w:space="0" w:sz="0" w:val="nil"/>
+          <w:left w:space="0" w:sz="0" w:val="nil"/>
+          <w:bottom w:space="0" w:sz="0" w:val="nil"/>
+          <w:right w:space="0" w:sz="0" w:val="nil"/>
+          <w:between w:space="0" w:sz="0" w:val="nil"/>
+        </w:pBdr>
+        <w:shd w:fill="auto" w:val="clear"/>
+        <w:spacing w:after="0" w:before="0" w:line="276" w:lineRule="auto"/>
+        <w:ind w:left="0" w:right="0" w:firstLine="0"/>
+        <w:jc w:val="left"/>
+        <w:rPr/>
+      </w:pPr>
+      <w:r>
+        <w:rPr>
+          <w:rtl w:val="0"/>
+        </w:rPr>
+        <w:t xml:space="preserve">    content = 'Retrieval task: ' + retrieval_task + '\n\nRAG context: ' + rag_context + '\n\nGraph context: ' + graph_context</w:t>
       </w:r>
     </w:p>
     <w:p>
@@ -732,7 +1821,7 @@
         <w:rPr>
           <w:rtl w:val="0"/>
         </w:rPr>
-        <w:t xml:space="preserve">    content = f'Task: {output_task}\n\nValidated knowledge: {kr_output}'</w:t>
+        <w:t xml:space="preserve">    content = 'Task: ' + output_task + '\n\nValidated knowledge: ' + kr_output</w:t>
       </w:r>
     </w:p>
     <w:p>
@@ -861,7 +1950,7 @@
         <w:rPr>
           <w:rtl w:val="0"/>
         </w:rPr>
-        <w:t xml:space="preserve">    content = f'Validation criteria: {validation_task}\n\nOutput to validate: {coder_output}'</w:t>
+        <w:t xml:space="preserve">    content = 'Validation criteria: ' + validation_task + '\n\nOutput to validate: ' + coder_output</w:t>
       </w:r>
     </w:p>
     <w:p>
@@ -1404,6 +2493,986 @@
         <w:rPr>
           <w:rtl w:val="0"/>
         </w:rPr>
+        <w:t xml:space="preserve">def run_pipeline_sqs(task, rag_context, graph_context, plan, sections):</w:t>
+      </w:r>
+    </w:p>
+    <w:p>
+      <w:pPr>
+        <w:keepNext w:val="0"/>
+        <w:keepLines w:val="0"/>
+        <w:pageBreakBefore w:val="0"/>
+        <w:widowControl w:val="0"/>
+        <w:pBdr>
+          <w:top w:space="0" w:sz="0" w:val="nil"/>
+          <w:left w:space="0" w:sz="0" w:val="nil"/>
+          <w:bottom w:space="0" w:sz="0" w:val="nil"/>
+          <w:right w:space="0" w:sz="0" w:val="nil"/>
+          <w:between w:space="0" w:sz="0" w:val="nil"/>
+        </w:pBdr>
+        <w:shd w:fill="auto" w:val="clear"/>
+        <w:spacing w:after="0" w:before="0" w:line="276" w:lineRule="auto"/>
+        <w:ind w:left="0" w:right="0" w:firstLine="0"/>
+        <w:jc w:val="left"/>
+        <w:rPr/>
+      </w:pPr>
+      <w:r>
+        <w:rPr>
+          <w:rtl w:val="0"/>
+        </w:rPr>
+        <w:t xml:space="preserve">    # SQS-coordinated pipeline -- publishes tasks to agent queues</w:t>
+      </w:r>
+    </w:p>
+    <w:p>
+      <w:pPr>
+        <w:keepNext w:val="0"/>
+        <w:keepLines w:val="0"/>
+        <w:pageBreakBefore w:val="0"/>
+        <w:widowControl w:val="0"/>
+        <w:pBdr>
+          <w:top w:space="0" w:sz="0" w:val="nil"/>
+          <w:left w:space="0" w:sz="0" w:val="nil"/>
+          <w:bottom w:space="0" w:sz="0" w:val="nil"/>
+          <w:right w:space="0" w:sz="0" w:val="nil"/>
+          <w:between w:space="0" w:sz="0" w:val="nil"/>
+        </w:pBdr>
+        <w:shd w:fill="auto" w:val="clear"/>
+        <w:spacing w:after="0" w:before="0" w:line="276" w:lineRule="auto"/>
+        <w:ind w:left="0" w:right="0" w:firstLine="0"/>
+        <w:jc w:val="left"/>
+        <w:rPr/>
+      </w:pPr>
+      <w:r>
+        <w:rPr>
+          <w:rtl w:val="0"/>
+        </w:rPr>
+        <w:t xml:space="preserve">    # Polls for results with 20-second long-poll</w:t>
+      </w:r>
+    </w:p>
+    <w:p>
+      <w:pPr>
+        <w:keepNext w:val="0"/>
+        <w:keepLines w:val="0"/>
+        <w:pageBreakBefore w:val="0"/>
+        <w:widowControl w:val="0"/>
+        <w:pBdr>
+          <w:top w:space="0" w:sz="0" w:val="nil"/>
+          <w:left w:space="0" w:sz="0" w:val="nil"/>
+          <w:bottom w:space="0" w:sz="0" w:val="nil"/>
+          <w:right w:space="0" w:sz="0" w:val="nil"/>
+          <w:between w:space="0" w:sz="0" w:val="nil"/>
+        </w:pBdr>
+        <w:shd w:fill="auto" w:val="clear"/>
+        <w:spacing w:after="0" w:before="0" w:line="276" w:lineRule="auto"/>
+        <w:ind w:left="0" w:right="0" w:firstLine="0"/>
+        <w:jc w:val="left"/>
+        <w:rPr/>
+      </w:pPr>
+      <w:r>
+        <w:rPr>
+          <w:rtl w:val="0"/>
+        </w:rPr>
+        <w:t xml:space="preserve">    # Falls back to direct execution on poll timeout</w:t>
+      </w:r>
+    </w:p>
+    <w:p>
+      <w:pPr>
+        <w:keepNext w:val="0"/>
+        <w:keepLines w:val="0"/>
+        <w:pageBreakBefore w:val="0"/>
+        <w:widowControl w:val="0"/>
+        <w:pBdr>
+          <w:top w:space="0" w:sz="0" w:val="nil"/>
+          <w:left w:space="0" w:sz="0" w:val="nil"/>
+          <w:bottom w:space="0" w:sz="0" w:val="nil"/>
+          <w:right w:space="0" w:sz="0" w:val="nil"/>
+          <w:between w:space="0" w:sz="0" w:val="nil"/>
+        </w:pBdr>
+        <w:shd w:fill="auto" w:val="clear"/>
+        <w:spacing w:after="0" w:before="0" w:line="276" w:lineRule="auto"/>
+        <w:ind w:left="0" w:right="0" w:firstLine="0"/>
+        <w:jc w:val="left"/>
+        <w:rPr/>
+      </w:pPr>
+      <w:r>
+        <w:rPr>
+          <w:rtl w:val="0"/>
+        </w:rPr>
+      </w:r>
+    </w:p>
+    <w:p>
+      <w:pPr>
+        <w:keepNext w:val="0"/>
+        <w:keepLines w:val="0"/>
+        <w:pageBreakBefore w:val="0"/>
+        <w:widowControl w:val="0"/>
+        <w:pBdr>
+          <w:top w:space="0" w:sz="0" w:val="nil"/>
+          <w:left w:space="0" w:sz="0" w:val="nil"/>
+          <w:bottom w:space="0" w:sz="0" w:val="nil"/>
+          <w:right w:space="0" w:sz="0" w:val="nil"/>
+          <w:between w:space="0" w:sz="0" w:val="nil"/>
+        </w:pBdr>
+        <w:shd w:fill="auto" w:val="clear"/>
+        <w:spacing w:after="0" w:before="0" w:line="276" w:lineRule="auto"/>
+        <w:ind w:left="0" w:right="0" w:firstLine="0"/>
+        <w:jc w:val="left"/>
+        <w:rPr/>
+      </w:pPr>
+      <w:r>
+        <w:rPr>
+          <w:rtl w:val="0"/>
+        </w:rPr>
+        <w:t xml:space="preserve">    # Publish KR task to queue</w:t>
+      </w:r>
+    </w:p>
+    <w:p>
+      <w:pPr>
+        <w:keepNext w:val="0"/>
+        <w:keepLines w:val="0"/>
+        <w:pageBreakBefore w:val="0"/>
+        <w:widowControl w:val="0"/>
+        <w:pBdr>
+          <w:top w:space="0" w:sz="0" w:val="nil"/>
+          <w:left w:space="0" w:sz="0" w:val="nil"/>
+          <w:bottom w:space="0" w:sz="0" w:val="nil"/>
+          <w:right w:space="0" w:sz="0" w:val="nil"/>
+          <w:between w:space="0" w:sz="0" w:val="nil"/>
+        </w:pBdr>
+        <w:shd w:fill="auto" w:val="clear"/>
+        <w:spacing w:after="0" w:before="0" w:line="276" w:lineRule="auto"/>
+        <w:ind w:left="0" w:right="0" w:firstLine="0"/>
+        <w:jc w:val="left"/>
+        <w:rPr/>
+      </w:pPr>
+      <w:r>
+        <w:rPr>
+          <w:rtl w:val="0"/>
+        </w:rPr>
+        <w:t xml:space="preserve">    sqs_send(Q_KR, {'task': sections['RETRIEVAL'], 'rag_context': rag_context, 'graph_context': graph_context})</w:t>
+      </w:r>
+    </w:p>
+    <w:p>
+      <w:pPr>
+        <w:keepNext w:val="0"/>
+        <w:keepLines w:val="0"/>
+        <w:pageBreakBefore w:val="0"/>
+        <w:widowControl w:val="0"/>
+        <w:pBdr>
+          <w:top w:space="0" w:sz="0" w:val="nil"/>
+          <w:left w:space="0" w:sz="0" w:val="nil"/>
+          <w:bottom w:space="0" w:sz="0" w:val="nil"/>
+          <w:right w:space="0" w:sz="0" w:val="nil"/>
+          <w:between w:space="0" w:sz="0" w:val="nil"/>
+        </w:pBdr>
+        <w:shd w:fill="auto" w:val="clear"/>
+        <w:spacing w:after="0" w:before="0" w:line="276" w:lineRule="auto"/>
+        <w:ind w:left="0" w:right="0" w:firstLine="0"/>
+        <w:jc w:val="left"/>
+        <w:rPr/>
+      </w:pPr>
+      <w:r>
+        <w:rPr>
+          <w:rtl w:val="0"/>
+        </w:rPr>
+      </w:r>
+    </w:p>
+    <w:p>
+      <w:pPr>
+        <w:keepNext w:val="0"/>
+        <w:keepLines w:val="0"/>
+        <w:pageBreakBefore w:val="0"/>
+        <w:widowControl w:val="0"/>
+        <w:pBdr>
+          <w:top w:space="0" w:sz="0" w:val="nil"/>
+          <w:left w:space="0" w:sz="0" w:val="nil"/>
+          <w:bottom w:space="0" w:sz="0" w:val="nil"/>
+          <w:right w:space="0" w:sz="0" w:val="nil"/>
+          <w:between w:space="0" w:sz="0" w:val="nil"/>
+        </w:pBdr>
+        <w:shd w:fill="auto" w:val="clear"/>
+        <w:spacing w:after="0" w:before="0" w:line="276" w:lineRule="auto"/>
+        <w:ind w:left="0" w:right="0" w:firstLine="0"/>
+        <w:jc w:val="left"/>
+        <w:rPr/>
+      </w:pPr>
+      <w:r>
+        <w:rPr>
+          <w:rtl w:val="0"/>
+        </w:rPr>
+        <w:t xml:space="preserve">    # Poll KR response queue (moderator queue receives agent results)</w:t>
+      </w:r>
+    </w:p>
+    <w:p>
+      <w:pPr>
+        <w:keepNext w:val="0"/>
+        <w:keepLines w:val="0"/>
+        <w:pageBreakBefore w:val="0"/>
+        <w:widowControl w:val="0"/>
+        <w:pBdr>
+          <w:top w:space="0" w:sz="0" w:val="nil"/>
+          <w:left w:space="0" w:sz="0" w:val="nil"/>
+          <w:bottom w:space="0" w:sz="0" w:val="nil"/>
+          <w:right w:space="0" w:sz="0" w:val="nil"/>
+          <w:between w:space="0" w:sz="0" w:val="nil"/>
+        </w:pBdr>
+        <w:shd w:fill="auto" w:val="clear"/>
+        <w:spacing w:after="0" w:before="0" w:line="276" w:lineRule="auto"/>
+        <w:ind w:left="0" w:right="0" w:firstLine="0"/>
+        <w:jc w:val="left"/>
+        <w:rPr/>
+      </w:pPr>
+      <w:r>
+        <w:rPr>
+          <w:rtl w:val="0"/>
+        </w:rPr>
+        <w:t xml:space="preserve">    kr_result = sqs_poll(Q_MODERATOR, wait_seconds=20)</w:t>
+      </w:r>
+    </w:p>
+    <w:p>
+      <w:pPr>
+        <w:keepNext w:val="0"/>
+        <w:keepLines w:val="0"/>
+        <w:pageBreakBefore w:val="0"/>
+        <w:widowControl w:val="0"/>
+        <w:pBdr>
+          <w:top w:space="0" w:sz="0" w:val="nil"/>
+          <w:left w:space="0" w:sz="0" w:val="nil"/>
+          <w:bottom w:space="0" w:sz="0" w:val="nil"/>
+          <w:right w:space="0" w:sz="0" w:val="nil"/>
+          <w:between w:space="0" w:sz="0" w:val="nil"/>
+        </w:pBdr>
+        <w:shd w:fill="auto" w:val="clear"/>
+        <w:spacing w:after="0" w:before="0" w:line="276" w:lineRule="auto"/>
+        <w:ind w:left="0" w:right="0" w:firstLine="0"/>
+        <w:jc w:val="left"/>
+        <w:rPr/>
+      </w:pPr>
+      <w:r>
+        <w:rPr>
+          <w:rtl w:val="0"/>
+        </w:rPr>
+        <w:t xml:space="preserve">    if kr_result:</w:t>
+      </w:r>
+    </w:p>
+    <w:p>
+      <w:pPr>
+        <w:keepNext w:val="0"/>
+        <w:keepLines w:val="0"/>
+        <w:pageBreakBefore w:val="0"/>
+        <w:widowControl w:val="0"/>
+        <w:pBdr>
+          <w:top w:space="0" w:sz="0" w:val="nil"/>
+          <w:left w:space="0" w:sz="0" w:val="nil"/>
+          <w:bottom w:space="0" w:sz="0" w:val="nil"/>
+          <w:right w:space="0" w:sz="0" w:val="nil"/>
+          <w:between w:space="0" w:sz="0" w:val="nil"/>
+        </w:pBdr>
+        <w:shd w:fill="auto" w:val="clear"/>
+        <w:spacing w:after="0" w:before="0" w:line="276" w:lineRule="auto"/>
+        <w:ind w:left="0" w:right="0" w:firstLine="0"/>
+        <w:jc w:val="left"/>
+        <w:rPr/>
+      </w:pPr>
+      <w:r>
+        <w:rPr>
+          <w:rtl w:val="0"/>
+        </w:rPr>
+        <w:t xml:space="preserve">        kr_output = kr_result.get('result', '')</w:t>
+      </w:r>
+    </w:p>
+    <w:p>
+      <w:pPr>
+        <w:keepNext w:val="0"/>
+        <w:keepLines w:val="0"/>
+        <w:pageBreakBefore w:val="0"/>
+        <w:widowControl w:val="0"/>
+        <w:pBdr>
+          <w:top w:space="0" w:sz="0" w:val="nil"/>
+          <w:left w:space="0" w:sz="0" w:val="nil"/>
+          <w:bottom w:space="0" w:sz="0" w:val="nil"/>
+          <w:right w:space="0" w:sz="0" w:val="nil"/>
+          <w:between w:space="0" w:sz="0" w:val="nil"/>
+        </w:pBdr>
+        <w:shd w:fill="auto" w:val="clear"/>
+        <w:spacing w:after="0" w:before="0" w:line="276" w:lineRule="auto"/>
+        <w:ind w:left="0" w:right="0" w:firstLine="0"/>
+        <w:jc w:val="left"/>
+        <w:rPr/>
+      </w:pPr>
+      <w:r>
+        <w:rPr>
+          <w:rtl w:val="0"/>
+        </w:rPr>
+        <w:t xml:space="preserve">    else:</w:t>
+      </w:r>
+    </w:p>
+    <w:p>
+      <w:pPr>
+        <w:keepNext w:val="0"/>
+        <w:keepLines w:val="0"/>
+        <w:pageBreakBefore w:val="0"/>
+        <w:widowControl w:val="0"/>
+        <w:pBdr>
+          <w:top w:space="0" w:sz="0" w:val="nil"/>
+          <w:left w:space="0" w:sz="0" w:val="nil"/>
+          <w:bottom w:space="0" w:sz="0" w:val="nil"/>
+          <w:right w:space="0" w:sz="0" w:val="nil"/>
+          <w:between w:space="0" w:sz="0" w:val="nil"/>
+        </w:pBdr>
+        <w:shd w:fill="auto" w:val="clear"/>
+        <w:spacing w:after="0" w:before="0" w:line="276" w:lineRule="auto"/>
+        <w:ind w:left="0" w:right="0" w:firstLine="0"/>
+        <w:jc w:val="left"/>
+        <w:rPr/>
+      </w:pPr>
+      <w:r>
+        <w:rPr>
+          <w:rtl w:val="0"/>
+        </w:rPr>
+        <w:t xml:space="preserve">        # Fallback to direct execution if SQS times out</w:t>
+      </w:r>
+    </w:p>
+    <w:p>
+      <w:pPr>
+        <w:keepNext w:val="0"/>
+        <w:keepLines w:val="0"/>
+        <w:pageBreakBefore w:val="0"/>
+        <w:widowControl w:val="0"/>
+        <w:pBdr>
+          <w:top w:space="0" w:sz="0" w:val="nil"/>
+          <w:left w:space="0" w:sz="0" w:val="nil"/>
+          <w:bottom w:space="0" w:sz="0" w:val="nil"/>
+          <w:right w:space="0" w:sz="0" w:val="nil"/>
+          <w:between w:space="0" w:sz="0" w:val="nil"/>
+        </w:pBdr>
+        <w:shd w:fill="auto" w:val="clear"/>
+        <w:spacing w:after="0" w:before="0" w:line="276" w:lineRule="auto"/>
+        <w:ind w:left="0" w:right="0" w:firstLine="0"/>
+        <w:jc w:val="left"/>
+        <w:rPr/>
+      </w:pPr>
+      <w:r>
+        <w:rPr>
+          <w:rtl w:val="0"/>
+        </w:rPr>
+        <w:t xml:space="preserve">        kr_output = knowledge_retrieval(sections['RETRIEVAL'], rag_context, graph_context)</w:t>
+      </w:r>
+    </w:p>
+    <w:p>
+      <w:pPr>
+        <w:keepNext w:val="0"/>
+        <w:keepLines w:val="0"/>
+        <w:pageBreakBefore w:val="0"/>
+        <w:widowControl w:val="0"/>
+        <w:pBdr>
+          <w:top w:space="0" w:sz="0" w:val="nil"/>
+          <w:left w:space="0" w:sz="0" w:val="nil"/>
+          <w:bottom w:space="0" w:sz="0" w:val="nil"/>
+          <w:right w:space="0" w:sz="0" w:val="nil"/>
+          <w:between w:space="0" w:sz="0" w:val="nil"/>
+        </w:pBdr>
+        <w:shd w:fill="auto" w:val="clear"/>
+        <w:spacing w:after="0" w:before="0" w:line="276" w:lineRule="auto"/>
+        <w:ind w:left="0" w:right="0" w:firstLine="0"/>
+        <w:jc w:val="left"/>
+        <w:rPr/>
+      </w:pPr>
+      <w:r>
+        <w:rPr>
+          <w:rtl w:val="0"/>
+        </w:rPr>
+      </w:r>
+    </w:p>
+    <w:p>
+      <w:pPr>
+        <w:keepNext w:val="0"/>
+        <w:keepLines w:val="0"/>
+        <w:pageBreakBefore w:val="0"/>
+        <w:widowControl w:val="0"/>
+        <w:pBdr>
+          <w:top w:space="0" w:sz="0" w:val="nil"/>
+          <w:left w:space="0" w:sz="0" w:val="nil"/>
+          <w:bottom w:space="0" w:sz="0" w:val="nil"/>
+          <w:right w:space="0" w:sz="0" w:val="nil"/>
+          <w:between w:space="0" w:sz="0" w:val="nil"/>
+        </w:pBdr>
+        <w:shd w:fill="auto" w:val="clear"/>
+        <w:spacing w:after="0" w:before="0" w:line="276" w:lineRule="auto"/>
+        <w:ind w:left="0" w:right="0" w:firstLine="0"/>
+        <w:jc w:val="left"/>
+        <w:rPr/>
+      </w:pPr>
+      <w:r>
+        <w:rPr>
+          <w:rtl w:val="0"/>
+        </w:rPr>
+        <w:t xml:space="preserve">    # Publish CODER task</w:t>
+      </w:r>
+    </w:p>
+    <w:p>
+      <w:pPr>
+        <w:keepNext w:val="0"/>
+        <w:keepLines w:val="0"/>
+        <w:pageBreakBefore w:val="0"/>
+        <w:widowControl w:val="0"/>
+        <w:pBdr>
+          <w:top w:space="0" w:sz="0" w:val="nil"/>
+          <w:left w:space="0" w:sz="0" w:val="nil"/>
+          <w:bottom w:space="0" w:sz="0" w:val="nil"/>
+          <w:right w:space="0" w:sz="0" w:val="nil"/>
+          <w:between w:space="0" w:sz="0" w:val="nil"/>
+        </w:pBdr>
+        <w:shd w:fill="auto" w:val="clear"/>
+        <w:spacing w:after="0" w:before="0" w:line="276" w:lineRule="auto"/>
+        <w:ind w:left="0" w:right="0" w:firstLine="0"/>
+        <w:jc w:val="left"/>
+        <w:rPr/>
+      </w:pPr>
+      <w:r>
+        <w:rPr>
+          <w:rtl w:val="0"/>
+        </w:rPr>
+        <w:t xml:space="preserve">    sqs_send(Q_CODER, {'task': sections['OUTPUT'], 'kr_output': kr_output})</w:t>
+      </w:r>
+    </w:p>
+    <w:p>
+      <w:pPr>
+        <w:keepNext w:val="0"/>
+        <w:keepLines w:val="0"/>
+        <w:pageBreakBefore w:val="0"/>
+        <w:widowControl w:val="0"/>
+        <w:pBdr>
+          <w:top w:space="0" w:sz="0" w:val="nil"/>
+          <w:left w:space="0" w:sz="0" w:val="nil"/>
+          <w:bottom w:space="0" w:sz="0" w:val="nil"/>
+          <w:right w:space="0" w:sz="0" w:val="nil"/>
+          <w:between w:space="0" w:sz="0" w:val="nil"/>
+        </w:pBdr>
+        <w:shd w:fill="auto" w:val="clear"/>
+        <w:spacing w:after="0" w:before="0" w:line="276" w:lineRule="auto"/>
+        <w:ind w:left="0" w:right="0" w:firstLine="0"/>
+        <w:jc w:val="left"/>
+        <w:rPr/>
+      </w:pPr>
+      <w:r>
+        <w:rPr>
+          <w:rtl w:val="0"/>
+        </w:rPr>
+      </w:r>
+    </w:p>
+    <w:p>
+      <w:pPr>
+        <w:keepNext w:val="0"/>
+        <w:keepLines w:val="0"/>
+        <w:pageBreakBefore w:val="0"/>
+        <w:widowControl w:val="0"/>
+        <w:pBdr>
+          <w:top w:space="0" w:sz="0" w:val="nil"/>
+          <w:left w:space="0" w:sz="0" w:val="nil"/>
+          <w:bottom w:space="0" w:sz="0" w:val="nil"/>
+          <w:right w:space="0" w:sz="0" w:val="nil"/>
+          <w:between w:space="0" w:sz="0" w:val="nil"/>
+        </w:pBdr>
+        <w:shd w:fill="auto" w:val="clear"/>
+        <w:spacing w:after="0" w:before="0" w:line="276" w:lineRule="auto"/>
+        <w:ind w:left="0" w:right="0" w:firstLine="0"/>
+        <w:jc w:val="left"/>
+        <w:rPr/>
+      </w:pPr>
+      <w:r>
+        <w:rPr>
+          <w:rtl w:val="0"/>
+        </w:rPr>
+        <w:t xml:space="preserve">    # Poll CODER response</w:t>
+      </w:r>
+    </w:p>
+    <w:p>
+      <w:pPr>
+        <w:keepNext w:val="0"/>
+        <w:keepLines w:val="0"/>
+        <w:pageBreakBefore w:val="0"/>
+        <w:widowControl w:val="0"/>
+        <w:pBdr>
+          <w:top w:space="0" w:sz="0" w:val="nil"/>
+          <w:left w:space="0" w:sz="0" w:val="nil"/>
+          <w:bottom w:space="0" w:sz="0" w:val="nil"/>
+          <w:right w:space="0" w:sz="0" w:val="nil"/>
+          <w:between w:space="0" w:sz="0" w:val="nil"/>
+        </w:pBdr>
+        <w:shd w:fill="auto" w:val="clear"/>
+        <w:spacing w:after="0" w:before="0" w:line="276" w:lineRule="auto"/>
+        <w:ind w:left="0" w:right="0" w:firstLine="0"/>
+        <w:jc w:val="left"/>
+        <w:rPr/>
+      </w:pPr>
+      <w:r>
+        <w:rPr>
+          <w:rtl w:val="0"/>
+        </w:rPr>
+        <w:t xml:space="preserve">    coder_result = sqs_poll(Q_MODERATOR, wait_seconds=20)</w:t>
+      </w:r>
+    </w:p>
+    <w:p>
+      <w:pPr>
+        <w:keepNext w:val="0"/>
+        <w:keepLines w:val="0"/>
+        <w:pageBreakBefore w:val="0"/>
+        <w:widowControl w:val="0"/>
+        <w:pBdr>
+          <w:top w:space="0" w:sz="0" w:val="nil"/>
+          <w:left w:space="0" w:sz="0" w:val="nil"/>
+          <w:bottom w:space="0" w:sz="0" w:val="nil"/>
+          <w:right w:space="0" w:sz="0" w:val="nil"/>
+          <w:between w:space="0" w:sz="0" w:val="nil"/>
+        </w:pBdr>
+        <w:shd w:fill="auto" w:val="clear"/>
+        <w:spacing w:after="0" w:before="0" w:line="276" w:lineRule="auto"/>
+        <w:ind w:left="0" w:right="0" w:firstLine="0"/>
+        <w:jc w:val="left"/>
+        <w:rPr/>
+      </w:pPr>
+      <w:r>
+        <w:rPr>
+          <w:rtl w:val="0"/>
+        </w:rPr>
+        <w:t xml:space="preserve">    if coder_result:</w:t>
+      </w:r>
+    </w:p>
+    <w:p>
+      <w:pPr>
+        <w:keepNext w:val="0"/>
+        <w:keepLines w:val="0"/>
+        <w:pageBreakBefore w:val="0"/>
+        <w:widowControl w:val="0"/>
+        <w:pBdr>
+          <w:top w:space="0" w:sz="0" w:val="nil"/>
+          <w:left w:space="0" w:sz="0" w:val="nil"/>
+          <w:bottom w:space="0" w:sz="0" w:val="nil"/>
+          <w:right w:space="0" w:sz="0" w:val="nil"/>
+          <w:between w:space="0" w:sz="0" w:val="nil"/>
+        </w:pBdr>
+        <w:shd w:fill="auto" w:val="clear"/>
+        <w:spacing w:after="0" w:before="0" w:line="276" w:lineRule="auto"/>
+        <w:ind w:left="0" w:right="0" w:firstLine="0"/>
+        <w:jc w:val="left"/>
+        <w:rPr/>
+      </w:pPr>
+      <w:r>
+        <w:rPr>
+          <w:rtl w:val="0"/>
+        </w:rPr>
+        <w:t xml:space="preserve">        coder_output = coder_result.get('result', '')</w:t>
+      </w:r>
+    </w:p>
+    <w:p>
+      <w:pPr>
+        <w:keepNext w:val="0"/>
+        <w:keepLines w:val="0"/>
+        <w:pageBreakBefore w:val="0"/>
+        <w:widowControl w:val="0"/>
+        <w:pBdr>
+          <w:top w:space="0" w:sz="0" w:val="nil"/>
+          <w:left w:space="0" w:sz="0" w:val="nil"/>
+          <w:bottom w:space="0" w:sz="0" w:val="nil"/>
+          <w:right w:space="0" w:sz="0" w:val="nil"/>
+          <w:between w:space="0" w:sz="0" w:val="nil"/>
+        </w:pBdr>
+        <w:shd w:fill="auto" w:val="clear"/>
+        <w:spacing w:after="0" w:before="0" w:line="276" w:lineRule="auto"/>
+        <w:ind w:left="0" w:right="0" w:firstLine="0"/>
+        <w:jc w:val="left"/>
+        <w:rPr/>
+      </w:pPr>
+      <w:r>
+        <w:rPr>
+          <w:rtl w:val="0"/>
+        </w:rPr>
+        <w:t xml:space="preserve">    else:</w:t>
+      </w:r>
+    </w:p>
+    <w:p>
+      <w:pPr>
+        <w:keepNext w:val="0"/>
+        <w:keepLines w:val="0"/>
+        <w:pageBreakBefore w:val="0"/>
+        <w:widowControl w:val="0"/>
+        <w:pBdr>
+          <w:top w:space="0" w:sz="0" w:val="nil"/>
+          <w:left w:space="0" w:sz="0" w:val="nil"/>
+          <w:bottom w:space="0" w:sz="0" w:val="nil"/>
+          <w:right w:space="0" w:sz="0" w:val="nil"/>
+          <w:between w:space="0" w:sz="0" w:val="nil"/>
+        </w:pBdr>
+        <w:shd w:fill="auto" w:val="clear"/>
+        <w:spacing w:after="0" w:before="0" w:line="276" w:lineRule="auto"/>
+        <w:ind w:left="0" w:right="0" w:firstLine="0"/>
+        <w:jc w:val="left"/>
+        <w:rPr/>
+      </w:pPr>
+      <w:r>
+        <w:rPr>
+          <w:rtl w:val="0"/>
+        </w:rPr>
+        <w:t xml:space="preserve">        coder_output = coder(sections['OUTPUT'], kr_output)</w:t>
+      </w:r>
+    </w:p>
+    <w:p>
+      <w:pPr>
+        <w:keepNext w:val="0"/>
+        <w:keepLines w:val="0"/>
+        <w:pageBreakBefore w:val="0"/>
+        <w:widowControl w:val="0"/>
+        <w:pBdr>
+          <w:top w:space="0" w:sz="0" w:val="nil"/>
+          <w:left w:space="0" w:sz="0" w:val="nil"/>
+          <w:bottom w:space="0" w:sz="0" w:val="nil"/>
+          <w:right w:space="0" w:sz="0" w:val="nil"/>
+          <w:between w:space="0" w:sz="0" w:val="nil"/>
+        </w:pBdr>
+        <w:shd w:fill="auto" w:val="clear"/>
+        <w:spacing w:after="0" w:before="0" w:line="276" w:lineRule="auto"/>
+        <w:ind w:left="0" w:right="0" w:firstLine="0"/>
+        <w:jc w:val="left"/>
+        <w:rPr/>
+      </w:pPr>
+      <w:r>
+        <w:rPr>
+          <w:rtl w:val="0"/>
+        </w:rPr>
+      </w:r>
+    </w:p>
+    <w:p>
+      <w:pPr>
+        <w:keepNext w:val="0"/>
+        <w:keepLines w:val="0"/>
+        <w:pageBreakBefore w:val="0"/>
+        <w:widowControl w:val="0"/>
+        <w:pBdr>
+          <w:top w:space="0" w:sz="0" w:val="nil"/>
+          <w:left w:space="0" w:sz="0" w:val="nil"/>
+          <w:bottom w:space="0" w:sz="0" w:val="nil"/>
+          <w:right w:space="0" w:sz="0" w:val="nil"/>
+          <w:between w:space="0" w:sz="0" w:val="nil"/>
+        </w:pBdr>
+        <w:shd w:fill="auto" w:val="clear"/>
+        <w:spacing w:after="0" w:before="0" w:line="276" w:lineRule="auto"/>
+        <w:ind w:left="0" w:right="0" w:firstLine="0"/>
+        <w:jc w:val="left"/>
+        <w:rPr/>
+      </w:pPr>
+      <w:r>
+        <w:rPr>
+          <w:rtl w:val="0"/>
+        </w:rPr>
+        <w:t xml:space="preserve">    # Publish DEBUG task</w:t>
+      </w:r>
+    </w:p>
+    <w:p>
+      <w:pPr>
+        <w:keepNext w:val="0"/>
+        <w:keepLines w:val="0"/>
+        <w:pageBreakBefore w:val="0"/>
+        <w:widowControl w:val="0"/>
+        <w:pBdr>
+          <w:top w:space="0" w:sz="0" w:val="nil"/>
+          <w:left w:space="0" w:sz="0" w:val="nil"/>
+          <w:bottom w:space="0" w:sz="0" w:val="nil"/>
+          <w:right w:space="0" w:sz="0" w:val="nil"/>
+          <w:between w:space="0" w:sz="0" w:val="nil"/>
+        </w:pBdr>
+        <w:shd w:fill="auto" w:val="clear"/>
+        <w:spacing w:after="0" w:before="0" w:line="276" w:lineRule="auto"/>
+        <w:ind w:left="0" w:right="0" w:firstLine="0"/>
+        <w:jc w:val="left"/>
+        <w:rPr/>
+      </w:pPr>
+      <w:r>
+        <w:rPr>
+          <w:rtl w:val="0"/>
+        </w:rPr>
+        <w:t xml:space="preserve">    sqs_send(Q_DEBUG, {'task': sections['VALIDATION'], 'coder_output': coder_output})</w:t>
+      </w:r>
+    </w:p>
+    <w:p>
+      <w:pPr>
+        <w:keepNext w:val="0"/>
+        <w:keepLines w:val="0"/>
+        <w:pageBreakBefore w:val="0"/>
+        <w:widowControl w:val="0"/>
+        <w:pBdr>
+          <w:top w:space="0" w:sz="0" w:val="nil"/>
+          <w:left w:space="0" w:sz="0" w:val="nil"/>
+          <w:bottom w:space="0" w:sz="0" w:val="nil"/>
+          <w:right w:space="0" w:sz="0" w:val="nil"/>
+          <w:between w:space="0" w:sz="0" w:val="nil"/>
+        </w:pBdr>
+        <w:shd w:fill="auto" w:val="clear"/>
+        <w:spacing w:after="0" w:before="0" w:line="276" w:lineRule="auto"/>
+        <w:ind w:left="0" w:right="0" w:firstLine="0"/>
+        <w:jc w:val="left"/>
+        <w:rPr/>
+      </w:pPr>
+      <w:r>
+        <w:rPr>
+          <w:rtl w:val="0"/>
+        </w:rPr>
+      </w:r>
+    </w:p>
+    <w:p>
+      <w:pPr>
+        <w:keepNext w:val="0"/>
+        <w:keepLines w:val="0"/>
+        <w:pageBreakBefore w:val="0"/>
+        <w:widowControl w:val="0"/>
+        <w:pBdr>
+          <w:top w:space="0" w:sz="0" w:val="nil"/>
+          <w:left w:space="0" w:sz="0" w:val="nil"/>
+          <w:bottom w:space="0" w:sz="0" w:val="nil"/>
+          <w:right w:space="0" w:sz="0" w:val="nil"/>
+          <w:between w:space="0" w:sz="0" w:val="nil"/>
+        </w:pBdr>
+        <w:shd w:fill="auto" w:val="clear"/>
+        <w:spacing w:after="0" w:before="0" w:line="276" w:lineRule="auto"/>
+        <w:ind w:left="0" w:right="0" w:firstLine="0"/>
+        <w:jc w:val="left"/>
+        <w:rPr/>
+      </w:pPr>
+      <w:r>
+        <w:rPr>
+          <w:rtl w:val="0"/>
+        </w:rPr>
+        <w:t xml:space="preserve">    # Poll DEBUG response</w:t>
+      </w:r>
+    </w:p>
+    <w:p>
+      <w:pPr>
+        <w:keepNext w:val="0"/>
+        <w:keepLines w:val="0"/>
+        <w:pageBreakBefore w:val="0"/>
+        <w:widowControl w:val="0"/>
+        <w:pBdr>
+          <w:top w:space="0" w:sz="0" w:val="nil"/>
+          <w:left w:space="0" w:sz="0" w:val="nil"/>
+          <w:bottom w:space="0" w:sz="0" w:val="nil"/>
+          <w:right w:space="0" w:sz="0" w:val="nil"/>
+          <w:between w:space="0" w:sz="0" w:val="nil"/>
+        </w:pBdr>
+        <w:shd w:fill="auto" w:val="clear"/>
+        <w:spacing w:after="0" w:before="0" w:line="276" w:lineRule="auto"/>
+        <w:ind w:left="0" w:right="0" w:firstLine="0"/>
+        <w:jc w:val="left"/>
+        <w:rPr/>
+      </w:pPr>
+      <w:r>
+        <w:rPr>
+          <w:rtl w:val="0"/>
+        </w:rPr>
+        <w:t xml:space="preserve">    debug_result = sqs_poll(Q_MODERATOR, wait_seconds=20)</w:t>
+      </w:r>
+    </w:p>
+    <w:p>
+      <w:pPr>
+        <w:keepNext w:val="0"/>
+        <w:keepLines w:val="0"/>
+        <w:pageBreakBefore w:val="0"/>
+        <w:widowControl w:val="0"/>
+        <w:pBdr>
+          <w:top w:space="0" w:sz="0" w:val="nil"/>
+          <w:left w:space="0" w:sz="0" w:val="nil"/>
+          <w:bottom w:space="0" w:sz="0" w:val="nil"/>
+          <w:right w:space="0" w:sz="0" w:val="nil"/>
+          <w:between w:space="0" w:sz="0" w:val="nil"/>
+        </w:pBdr>
+        <w:shd w:fill="auto" w:val="clear"/>
+        <w:spacing w:after="0" w:before="0" w:line="276" w:lineRule="auto"/>
+        <w:ind w:left="0" w:right="0" w:firstLine="0"/>
+        <w:jc w:val="left"/>
+        <w:rPr/>
+      </w:pPr>
+      <w:r>
+        <w:rPr>
+          <w:rtl w:val="0"/>
+        </w:rPr>
+        <w:t xml:space="preserve">    if debug_result:</w:t>
+      </w:r>
+    </w:p>
+    <w:p>
+      <w:pPr>
+        <w:keepNext w:val="0"/>
+        <w:keepLines w:val="0"/>
+        <w:pageBreakBefore w:val="0"/>
+        <w:widowControl w:val="0"/>
+        <w:pBdr>
+          <w:top w:space="0" w:sz="0" w:val="nil"/>
+          <w:left w:space="0" w:sz="0" w:val="nil"/>
+          <w:bottom w:space="0" w:sz="0" w:val="nil"/>
+          <w:right w:space="0" w:sz="0" w:val="nil"/>
+          <w:between w:space="0" w:sz="0" w:val="nil"/>
+        </w:pBdr>
+        <w:shd w:fill="auto" w:val="clear"/>
+        <w:spacing w:after="0" w:before="0" w:line="276" w:lineRule="auto"/>
+        <w:ind w:left="0" w:right="0" w:firstLine="0"/>
+        <w:jc w:val="left"/>
+        <w:rPr/>
+      </w:pPr>
+      <w:r>
+        <w:rPr>
+          <w:rtl w:val="0"/>
+        </w:rPr>
+        <w:t xml:space="preserve">        final_output = debug_result.get('result', '')</w:t>
+      </w:r>
+    </w:p>
+    <w:p>
+      <w:pPr>
+        <w:keepNext w:val="0"/>
+        <w:keepLines w:val="0"/>
+        <w:pageBreakBefore w:val="0"/>
+        <w:widowControl w:val="0"/>
+        <w:pBdr>
+          <w:top w:space="0" w:sz="0" w:val="nil"/>
+          <w:left w:space="0" w:sz="0" w:val="nil"/>
+          <w:bottom w:space="0" w:sz="0" w:val="nil"/>
+          <w:right w:space="0" w:sz="0" w:val="nil"/>
+          <w:between w:space="0" w:sz="0" w:val="nil"/>
+        </w:pBdr>
+        <w:shd w:fill="auto" w:val="clear"/>
+        <w:spacing w:after="0" w:before="0" w:line="276" w:lineRule="auto"/>
+        <w:ind w:left="0" w:right="0" w:firstLine="0"/>
+        <w:jc w:val="left"/>
+        <w:rPr/>
+      </w:pPr>
+      <w:r>
+        <w:rPr>
+          <w:rtl w:val="0"/>
+        </w:rPr>
+        <w:t xml:space="preserve">    else:</w:t>
+      </w:r>
+    </w:p>
+    <w:p>
+      <w:pPr>
+        <w:keepNext w:val="0"/>
+        <w:keepLines w:val="0"/>
+        <w:pageBreakBefore w:val="0"/>
+        <w:widowControl w:val="0"/>
+        <w:pBdr>
+          <w:top w:space="0" w:sz="0" w:val="nil"/>
+          <w:left w:space="0" w:sz="0" w:val="nil"/>
+          <w:bottom w:space="0" w:sz="0" w:val="nil"/>
+          <w:right w:space="0" w:sz="0" w:val="nil"/>
+          <w:between w:space="0" w:sz="0" w:val="nil"/>
+        </w:pBdr>
+        <w:shd w:fill="auto" w:val="clear"/>
+        <w:spacing w:after="0" w:before="0" w:line="276" w:lineRule="auto"/>
+        <w:ind w:left="0" w:right="0" w:firstLine="0"/>
+        <w:jc w:val="left"/>
+        <w:rPr/>
+      </w:pPr>
+      <w:r>
+        <w:rPr>
+          <w:rtl w:val="0"/>
+        </w:rPr>
+        <w:t xml:space="preserve">        final_output = debug_gate(coder_output, sections['VALIDATION'])</w:t>
+      </w:r>
+    </w:p>
+    <w:p>
+      <w:pPr>
+        <w:keepNext w:val="0"/>
+        <w:keepLines w:val="0"/>
+        <w:pageBreakBefore w:val="0"/>
+        <w:widowControl w:val="0"/>
+        <w:pBdr>
+          <w:top w:space="0" w:sz="0" w:val="nil"/>
+          <w:left w:space="0" w:sz="0" w:val="nil"/>
+          <w:bottom w:space="0" w:sz="0" w:val="nil"/>
+          <w:right w:space="0" w:sz="0" w:val="nil"/>
+          <w:between w:space="0" w:sz="0" w:val="nil"/>
+        </w:pBdr>
+        <w:shd w:fill="auto" w:val="clear"/>
+        <w:spacing w:after="0" w:before="0" w:line="276" w:lineRule="auto"/>
+        <w:ind w:left="0" w:right="0" w:firstLine="0"/>
+        <w:jc w:val="left"/>
+        <w:rPr/>
+      </w:pPr>
+      <w:r>
+        <w:rPr>
+          <w:rtl w:val="0"/>
+        </w:rPr>
+      </w:r>
+    </w:p>
+    <w:p>
+      <w:pPr>
+        <w:keepNext w:val="0"/>
+        <w:keepLines w:val="0"/>
+        <w:pageBreakBefore w:val="0"/>
+        <w:widowControl w:val="0"/>
+        <w:pBdr>
+          <w:top w:space="0" w:sz="0" w:val="nil"/>
+          <w:left w:space="0" w:sz="0" w:val="nil"/>
+          <w:bottom w:space="0" w:sz="0" w:val="nil"/>
+          <w:right w:space="0" w:sz="0" w:val="nil"/>
+          <w:between w:space="0" w:sz="0" w:val="nil"/>
+        </w:pBdr>
+        <w:shd w:fill="auto" w:val="clear"/>
+        <w:spacing w:after="0" w:before="0" w:line="276" w:lineRule="auto"/>
+        <w:ind w:left="0" w:right="0" w:firstLine="0"/>
+        <w:jc w:val="left"/>
+        <w:rPr/>
+      </w:pPr>
+      <w:r>
+        <w:rPr>
+          <w:rtl w:val="0"/>
+        </w:rPr>
+        <w:t xml:space="preserve">    return kr_output, coder_output, final_output</w:t>
+      </w:r>
+    </w:p>
+    <w:p>
+      <w:pPr>
+        <w:keepNext w:val="0"/>
+        <w:keepLines w:val="0"/>
+        <w:pageBreakBefore w:val="0"/>
+        <w:widowControl w:val="0"/>
+        <w:pBdr>
+          <w:top w:space="0" w:sz="0" w:val="nil"/>
+          <w:left w:space="0" w:sz="0" w:val="nil"/>
+          <w:bottom w:space="0" w:sz="0" w:val="nil"/>
+          <w:right w:space="0" w:sz="0" w:val="nil"/>
+          <w:between w:space="0" w:sz="0" w:val="nil"/>
+        </w:pBdr>
+        <w:shd w:fill="auto" w:val="clear"/>
+        <w:spacing w:after="0" w:before="0" w:line="276" w:lineRule="auto"/>
+        <w:ind w:left="0" w:right="0" w:firstLine="0"/>
+        <w:jc w:val="left"/>
+        <w:rPr/>
+      </w:pPr>
+      <w:r>
+        <w:rPr>
+          <w:rtl w:val="0"/>
+        </w:rPr>
+      </w:r>
+    </w:p>
+    <w:p>
+      <w:pPr>
+        <w:keepNext w:val="0"/>
+        <w:keepLines w:val="0"/>
+        <w:pageBreakBefore w:val="0"/>
+        <w:widowControl w:val="0"/>
+        <w:pBdr>
+          <w:top w:space="0" w:sz="0" w:val="nil"/>
+          <w:left w:space="0" w:sz="0" w:val="nil"/>
+          <w:bottom w:space="0" w:sz="0" w:val="nil"/>
+          <w:right w:space="0" w:sz="0" w:val="nil"/>
+          <w:between w:space="0" w:sz="0" w:val="nil"/>
+        </w:pBdr>
+        <w:shd w:fill="auto" w:val="clear"/>
+        <w:spacing w:after="0" w:before="0" w:line="276" w:lineRule="auto"/>
+        <w:ind w:left="0" w:right="0" w:firstLine="0"/>
+        <w:jc w:val="left"/>
+        <w:rPr/>
+      </w:pPr>
+      <w:r>
+        <w:rPr>
+          <w:rtl w:val="0"/>
+        </w:rPr>
         <w:t xml:space="preserve">def lambda_handler(event, context):</w:t>
       </w:r>
     </w:p>
@@ -1430,6 +3499,733 @@
         <w:rPr>
           <w:rtl w:val="0"/>
         </w:rPr>
+        <w:t xml:space="preserve">    # Check if invoked by SQS trigger -- agent execution mode</w:t>
+      </w:r>
+    </w:p>
+    <w:p>
+      <w:pPr>
+        <w:keepNext w:val="0"/>
+        <w:keepLines w:val="0"/>
+        <w:pageBreakBefore w:val="0"/>
+        <w:widowControl w:val="0"/>
+        <w:pBdr>
+          <w:top w:space="0" w:sz="0" w:val="nil"/>
+          <w:left w:space="0" w:sz="0" w:val="nil"/>
+          <w:bottom w:space="0" w:sz="0" w:val="nil"/>
+          <w:right w:space="0" w:sz="0" w:val="nil"/>
+          <w:between w:space="0" w:sz="0" w:val="nil"/>
+        </w:pBdr>
+        <w:shd w:fill="auto" w:val="clear"/>
+        <w:spacing w:after="0" w:before="0" w:line="276" w:lineRule="auto"/>
+        <w:ind w:left="0" w:right="0" w:firstLine="0"/>
+        <w:jc w:val="left"/>
+        <w:rPr/>
+      </w:pPr>
+      <w:r>
+        <w:rPr>
+          <w:rtl w:val="0"/>
+        </w:rPr>
+        <w:t xml:space="preserve">    if 'Records' in event:</w:t>
+      </w:r>
+    </w:p>
+    <w:p>
+      <w:pPr>
+        <w:keepNext w:val="0"/>
+        <w:keepLines w:val="0"/>
+        <w:pageBreakBefore w:val="0"/>
+        <w:widowControl w:val="0"/>
+        <w:pBdr>
+          <w:top w:space="0" w:sz="0" w:val="nil"/>
+          <w:left w:space="0" w:sz="0" w:val="nil"/>
+          <w:bottom w:space="0" w:sz="0" w:val="nil"/>
+          <w:right w:space="0" w:sz="0" w:val="nil"/>
+          <w:between w:space="0" w:sz="0" w:val="nil"/>
+        </w:pBdr>
+        <w:shd w:fill="auto" w:val="clear"/>
+        <w:spacing w:after="0" w:before="0" w:line="276" w:lineRule="auto"/>
+        <w:ind w:left="0" w:right="0" w:firstLine="0"/>
+        <w:jc w:val="left"/>
+        <w:rPr/>
+      </w:pPr>
+      <w:r>
+        <w:rPr>
+          <w:rtl w:val="0"/>
+        </w:rPr>
+        <w:t xml:space="preserve">        # SQS-triggered agent execution</w:t>
+      </w:r>
+    </w:p>
+    <w:p>
+      <w:pPr>
+        <w:keepNext w:val="0"/>
+        <w:keepLines w:val="0"/>
+        <w:pageBreakBefore w:val="0"/>
+        <w:widowControl w:val="0"/>
+        <w:pBdr>
+          <w:top w:space="0" w:sz="0" w:val="nil"/>
+          <w:left w:space="0" w:sz="0" w:val="nil"/>
+          <w:bottom w:space="0" w:sz="0" w:val="nil"/>
+          <w:right w:space="0" w:sz="0" w:val="nil"/>
+          <w:between w:space="0" w:sz="0" w:val="nil"/>
+        </w:pBdr>
+        <w:shd w:fill="auto" w:val="clear"/>
+        <w:spacing w:after="0" w:before="0" w:line="276" w:lineRule="auto"/>
+        <w:ind w:left="0" w:right="0" w:firstLine="0"/>
+        <w:jc w:val="left"/>
+        <w:rPr/>
+      </w:pPr>
+      <w:r>
+        <w:rPr>
+          <w:rtl w:val="0"/>
+        </w:rPr>
+        <w:t xml:space="preserve">        # Each record is a task dispatched by MODERATOR</w:t>
+      </w:r>
+    </w:p>
+    <w:p>
+      <w:pPr>
+        <w:keepNext w:val="0"/>
+        <w:keepLines w:val="0"/>
+        <w:pageBreakBefore w:val="0"/>
+        <w:widowControl w:val="0"/>
+        <w:pBdr>
+          <w:top w:space="0" w:sz="0" w:val="nil"/>
+          <w:left w:space="0" w:sz="0" w:val="nil"/>
+          <w:bottom w:space="0" w:sz="0" w:val="nil"/>
+          <w:right w:space="0" w:sz="0" w:val="nil"/>
+          <w:between w:space="0" w:sz="0" w:val="nil"/>
+        </w:pBdr>
+        <w:shd w:fill="auto" w:val="clear"/>
+        <w:spacing w:after="0" w:before="0" w:line="276" w:lineRule="auto"/>
+        <w:ind w:left="0" w:right="0" w:firstLine="0"/>
+        <w:jc w:val="left"/>
+        <w:rPr/>
+      </w:pPr>
+      <w:r>
+        <w:rPr>
+          <w:rtl w:val="0"/>
+        </w:rPr>
+        <w:t xml:space="preserve">        results = []</w:t>
+      </w:r>
+    </w:p>
+    <w:p>
+      <w:pPr>
+        <w:keepNext w:val="0"/>
+        <w:keepLines w:val="0"/>
+        <w:pageBreakBefore w:val="0"/>
+        <w:widowControl w:val="0"/>
+        <w:pBdr>
+          <w:top w:space="0" w:sz="0" w:val="nil"/>
+          <w:left w:space="0" w:sz="0" w:val="nil"/>
+          <w:bottom w:space="0" w:sz="0" w:val="nil"/>
+          <w:right w:space="0" w:sz="0" w:val="nil"/>
+          <w:between w:space="0" w:sz="0" w:val="nil"/>
+        </w:pBdr>
+        <w:shd w:fill="auto" w:val="clear"/>
+        <w:spacing w:after="0" w:before="0" w:line="276" w:lineRule="auto"/>
+        <w:ind w:left="0" w:right="0" w:firstLine="0"/>
+        <w:jc w:val="left"/>
+        <w:rPr/>
+      </w:pPr>
+      <w:r>
+        <w:rPr>
+          <w:rtl w:val="0"/>
+        </w:rPr>
+        <w:t xml:space="preserve">        for record in event['Records']:</w:t>
+      </w:r>
+    </w:p>
+    <w:p>
+      <w:pPr>
+        <w:keepNext w:val="0"/>
+        <w:keepLines w:val="0"/>
+        <w:pageBreakBefore w:val="0"/>
+        <w:widowControl w:val="0"/>
+        <w:pBdr>
+          <w:top w:space="0" w:sz="0" w:val="nil"/>
+          <w:left w:space="0" w:sz="0" w:val="nil"/>
+          <w:bottom w:space="0" w:sz="0" w:val="nil"/>
+          <w:right w:space="0" w:sz="0" w:val="nil"/>
+          <w:between w:space="0" w:sz="0" w:val="nil"/>
+        </w:pBdr>
+        <w:shd w:fill="auto" w:val="clear"/>
+        <w:spacing w:after="0" w:before="0" w:line="276" w:lineRule="auto"/>
+        <w:ind w:left="0" w:right="0" w:firstLine="0"/>
+        <w:jc w:val="left"/>
+        <w:rPr/>
+      </w:pPr>
+      <w:r>
+        <w:rPr>
+          <w:rtl w:val="0"/>
+        </w:rPr>
+        <w:t xml:space="preserve">            body = json.loads(record['body'])</w:t>
+      </w:r>
+    </w:p>
+    <w:p>
+      <w:pPr>
+        <w:keepNext w:val="0"/>
+        <w:keepLines w:val="0"/>
+        <w:pageBreakBefore w:val="0"/>
+        <w:widowControl w:val="0"/>
+        <w:pBdr>
+          <w:top w:space="0" w:sz="0" w:val="nil"/>
+          <w:left w:space="0" w:sz="0" w:val="nil"/>
+          <w:bottom w:space="0" w:sz="0" w:val="nil"/>
+          <w:right w:space="0" w:sz="0" w:val="nil"/>
+          <w:between w:space="0" w:sz="0" w:val="nil"/>
+        </w:pBdr>
+        <w:shd w:fill="auto" w:val="clear"/>
+        <w:spacing w:after="0" w:before="0" w:line="276" w:lineRule="auto"/>
+        <w:ind w:left="0" w:right="0" w:firstLine="0"/>
+        <w:jc w:val="left"/>
+        <w:rPr/>
+      </w:pPr>
+      <w:r>
+        <w:rPr>
+          <w:rtl w:val="0"/>
+        </w:rPr>
+        <w:t xml:space="preserve">            agent = body.get('agent', 'kr')</w:t>
+      </w:r>
+    </w:p>
+    <w:p>
+      <w:pPr>
+        <w:keepNext w:val="0"/>
+        <w:keepLines w:val="0"/>
+        <w:pageBreakBefore w:val="0"/>
+        <w:widowControl w:val="0"/>
+        <w:pBdr>
+          <w:top w:space="0" w:sz="0" w:val="nil"/>
+          <w:left w:space="0" w:sz="0" w:val="nil"/>
+          <w:bottom w:space="0" w:sz="0" w:val="nil"/>
+          <w:right w:space="0" w:sz="0" w:val="nil"/>
+          <w:between w:space="0" w:sz="0" w:val="nil"/>
+        </w:pBdr>
+        <w:shd w:fill="auto" w:val="clear"/>
+        <w:spacing w:after="0" w:before="0" w:line="276" w:lineRule="auto"/>
+        <w:ind w:left="0" w:right="0" w:firstLine="0"/>
+        <w:jc w:val="left"/>
+        <w:rPr/>
+      </w:pPr>
+      <w:r>
+        <w:rPr>
+          <w:rtl w:val="0"/>
+        </w:rPr>
+        <w:t xml:space="preserve">            task = body.get('task', '')</w:t>
+      </w:r>
+    </w:p>
+    <w:p>
+      <w:pPr>
+        <w:keepNext w:val="0"/>
+        <w:keepLines w:val="0"/>
+        <w:pageBreakBefore w:val="0"/>
+        <w:widowControl w:val="0"/>
+        <w:pBdr>
+          <w:top w:space="0" w:sz="0" w:val="nil"/>
+          <w:left w:space="0" w:sz="0" w:val="nil"/>
+          <w:bottom w:space="0" w:sz="0" w:val="nil"/>
+          <w:right w:space="0" w:sz="0" w:val="nil"/>
+          <w:between w:space="0" w:sz="0" w:val="nil"/>
+        </w:pBdr>
+        <w:shd w:fill="auto" w:val="clear"/>
+        <w:spacing w:after="0" w:before="0" w:line="276" w:lineRule="auto"/>
+        <w:ind w:left="0" w:right="0" w:firstLine="0"/>
+        <w:jc w:val="left"/>
+        <w:rPr/>
+      </w:pPr>
+      <w:r>
+        <w:rPr>
+          <w:rtl w:val="0"/>
+        </w:rPr>
+        <w:t xml:space="preserve">            rag_context = body.get('rag_context', '')</w:t>
+      </w:r>
+    </w:p>
+    <w:p>
+      <w:pPr>
+        <w:keepNext w:val="0"/>
+        <w:keepLines w:val="0"/>
+        <w:pageBreakBefore w:val="0"/>
+        <w:widowControl w:val="0"/>
+        <w:pBdr>
+          <w:top w:space="0" w:sz="0" w:val="nil"/>
+          <w:left w:space="0" w:sz="0" w:val="nil"/>
+          <w:bottom w:space="0" w:sz="0" w:val="nil"/>
+          <w:right w:space="0" w:sz="0" w:val="nil"/>
+          <w:between w:space="0" w:sz="0" w:val="nil"/>
+        </w:pBdr>
+        <w:shd w:fill="auto" w:val="clear"/>
+        <w:spacing w:after="0" w:before="0" w:line="276" w:lineRule="auto"/>
+        <w:ind w:left="0" w:right="0" w:firstLine="0"/>
+        <w:jc w:val="left"/>
+        <w:rPr/>
+      </w:pPr>
+      <w:r>
+        <w:rPr>
+          <w:rtl w:val="0"/>
+        </w:rPr>
+        <w:t xml:space="preserve">            graph_context = body.get('graph_context', '')</w:t>
+      </w:r>
+    </w:p>
+    <w:p>
+      <w:pPr>
+        <w:keepNext w:val="0"/>
+        <w:keepLines w:val="0"/>
+        <w:pageBreakBefore w:val="0"/>
+        <w:widowControl w:val="0"/>
+        <w:pBdr>
+          <w:top w:space="0" w:sz="0" w:val="nil"/>
+          <w:left w:space="0" w:sz="0" w:val="nil"/>
+          <w:bottom w:space="0" w:sz="0" w:val="nil"/>
+          <w:right w:space="0" w:sz="0" w:val="nil"/>
+          <w:between w:space="0" w:sz="0" w:val="nil"/>
+        </w:pBdr>
+        <w:shd w:fill="auto" w:val="clear"/>
+        <w:spacing w:after="0" w:before="0" w:line="276" w:lineRule="auto"/>
+        <w:ind w:left="0" w:right="0" w:firstLine="0"/>
+        <w:jc w:val="left"/>
+        <w:rPr/>
+      </w:pPr>
+      <w:r>
+        <w:rPr>
+          <w:rtl w:val="0"/>
+        </w:rPr>
+        <w:t xml:space="preserve">            kr_output = body.get('kr_output', '')</w:t>
+      </w:r>
+    </w:p>
+    <w:p>
+      <w:pPr>
+        <w:keepNext w:val="0"/>
+        <w:keepLines w:val="0"/>
+        <w:pageBreakBefore w:val="0"/>
+        <w:widowControl w:val="0"/>
+        <w:pBdr>
+          <w:top w:space="0" w:sz="0" w:val="nil"/>
+          <w:left w:space="0" w:sz="0" w:val="nil"/>
+          <w:bottom w:space="0" w:sz="0" w:val="nil"/>
+          <w:right w:space="0" w:sz="0" w:val="nil"/>
+          <w:between w:space="0" w:sz="0" w:val="nil"/>
+        </w:pBdr>
+        <w:shd w:fill="auto" w:val="clear"/>
+        <w:spacing w:after="0" w:before="0" w:line="276" w:lineRule="auto"/>
+        <w:ind w:left="0" w:right="0" w:firstLine="0"/>
+        <w:jc w:val="left"/>
+        <w:rPr/>
+      </w:pPr>
+      <w:r>
+        <w:rPr>
+          <w:rtl w:val="0"/>
+        </w:rPr>
+        <w:t xml:space="preserve">            coder_output = body.get('coder_output', '')</w:t>
+      </w:r>
+    </w:p>
+    <w:p>
+      <w:pPr>
+        <w:keepNext w:val="0"/>
+        <w:keepLines w:val="0"/>
+        <w:pageBreakBefore w:val="0"/>
+        <w:widowControl w:val="0"/>
+        <w:pBdr>
+          <w:top w:space="0" w:sz="0" w:val="nil"/>
+          <w:left w:space="0" w:sz="0" w:val="nil"/>
+          <w:bottom w:space="0" w:sz="0" w:val="nil"/>
+          <w:right w:space="0" w:sz="0" w:val="nil"/>
+          <w:between w:space="0" w:sz="0" w:val="nil"/>
+        </w:pBdr>
+        <w:shd w:fill="auto" w:val="clear"/>
+        <w:spacing w:after="0" w:before="0" w:line="276" w:lineRule="auto"/>
+        <w:ind w:left="0" w:right="0" w:firstLine="0"/>
+        <w:jc w:val="left"/>
+        <w:rPr/>
+      </w:pPr>
+      <w:r>
+        <w:rPr>
+          <w:rtl w:val="0"/>
+        </w:rPr>
+        <w:t xml:space="preserve">            validation_task = body.get('task', '')</w:t>
+      </w:r>
+    </w:p>
+    <w:p>
+      <w:pPr>
+        <w:keepNext w:val="0"/>
+        <w:keepLines w:val="0"/>
+        <w:pageBreakBefore w:val="0"/>
+        <w:widowControl w:val="0"/>
+        <w:pBdr>
+          <w:top w:space="0" w:sz="0" w:val="nil"/>
+          <w:left w:space="0" w:sz="0" w:val="nil"/>
+          <w:bottom w:space="0" w:sz="0" w:val="nil"/>
+          <w:right w:space="0" w:sz="0" w:val="nil"/>
+          <w:between w:space="0" w:sz="0" w:val="nil"/>
+        </w:pBdr>
+        <w:shd w:fill="auto" w:val="clear"/>
+        <w:spacing w:after="0" w:before="0" w:line="276" w:lineRule="auto"/>
+        <w:ind w:left="0" w:right="0" w:firstLine="0"/>
+        <w:jc w:val="left"/>
+        <w:rPr/>
+      </w:pPr>
+      <w:r>
+        <w:rPr>
+          <w:rtl w:val="0"/>
+        </w:rPr>
+        <w:t xml:space="preserve">            if agent == 'kr':</w:t>
+      </w:r>
+    </w:p>
+    <w:p>
+      <w:pPr>
+        <w:keepNext w:val="0"/>
+        <w:keepLines w:val="0"/>
+        <w:pageBreakBefore w:val="0"/>
+        <w:widowControl w:val="0"/>
+        <w:pBdr>
+          <w:top w:space="0" w:sz="0" w:val="nil"/>
+          <w:left w:space="0" w:sz="0" w:val="nil"/>
+          <w:bottom w:space="0" w:sz="0" w:val="nil"/>
+          <w:right w:space="0" w:sz="0" w:val="nil"/>
+          <w:between w:space="0" w:sz="0" w:val="nil"/>
+        </w:pBdr>
+        <w:shd w:fill="auto" w:val="clear"/>
+        <w:spacing w:after="0" w:before="0" w:line="276" w:lineRule="auto"/>
+        <w:ind w:left="0" w:right="0" w:firstLine="0"/>
+        <w:jc w:val="left"/>
+        <w:rPr/>
+      </w:pPr>
+      <w:r>
+        <w:rPr>
+          <w:rtl w:val="0"/>
+        </w:rPr>
+        <w:t xml:space="preserve">                result = knowledge_retrieval(task, rag_context, graph_context)</w:t>
+      </w:r>
+    </w:p>
+    <w:p>
+      <w:pPr>
+        <w:keepNext w:val="0"/>
+        <w:keepLines w:val="0"/>
+        <w:pageBreakBefore w:val="0"/>
+        <w:widowControl w:val="0"/>
+        <w:pBdr>
+          <w:top w:space="0" w:sz="0" w:val="nil"/>
+          <w:left w:space="0" w:sz="0" w:val="nil"/>
+          <w:bottom w:space="0" w:sz="0" w:val="nil"/>
+          <w:right w:space="0" w:sz="0" w:val="nil"/>
+          <w:between w:space="0" w:sz="0" w:val="nil"/>
+        </w:pBdr>
+        <w:shd w:fill="auto" w:val="clear"/>
+        <w:spacing w:after="0" w:before="0" w:line="276" w:lineRule="auto"/>
+        <w:ind w:left="0" w:right="0" w:firstLine="0"/>
+        <w:jc w:val="left"/>
+        <w:rPr/>
+      </w:pPr>
+      <w:r>
+        <w:rPr>
+          <w:rtl w:val="0"/>
+        </w:rPr>
+        <w:t xml:space="preserve">            elif agent == 'coder':</w:t>
+      </w:r>
+    </w:p>
+    <w:p>
+      <w:pPr>
+        <w:keepNext w:val="0"/>
+        <w:keepLines w:val="0"/>
+        <w:pageBreakBefore w:val="0"/>
+        <w:widowControl w:val="0"/>
+        <w:pBdr>
+          <w:top w:space="0" w:sz="0" w:val="nil"/>
+          <w:left w:space="0" w:sz="0" w:val="nil"/>
+          <w:bottom w:space="0" w:sz="0" w:val="nil"/>
+          <w:right w:space="0" w:sz="0" w:val="nil"/>
+          <w:between w:space="0" w:sz="0" w:val="nil"/>
+        </w:pBdr>
+        <w:shd w:fill="auto" w:val="clear"/>
+        <w:spacing w:after="0" w:before="0" w:line="276" w:lineRule="auto"/>
+        <w:ind w:left="0" w:right="0" w:firstLine="0"/>
+        <w:jc w:val="left"/>
+        <w:rPr/>
+      </w:pPr>
+      <w:r>
+        <w:rPr>
+          <w:rtl w:val="0"/>
+        </w:rPr>
+        <w:t xml:space="preserve">                result = coder(task, kr_output)</w:t>
+      </w:r>
+    </w:p>
+    <w:p>
+      <w:pPr>
+        <w:keepNext w:val="0"/>
+        <w:keepLines w:val="0"/>
+        <w:pageBreakBefore w:val="0"/>
+        <w:widowControl w:val="0"/>
+        <w:pBdr>
+          <w:top w:space="0" w:sz="0" w:val="nil"/>
+          <w:left w:space="0" w:sz="0" w:val="nil"/>
+          <w:bottom w:space="0" w:sz="0" w:val="nil"/>
+          <w:right w:space="0" w:sz="0" w:val="nil"/>
+          <w:between w:space="0" w:sz="0" w:val="nil"/>
+        </w:pBdr>
+        <w:shd w:fill="auto" w:val="clear"/>
+        <w:spacing w:after="0" w:before="0" w:line="276" w:lineRule="auto"/>
+        <w:ind w:left="0" w:right="0" w:firstLine="0"/>
+        <w:jc w:val="left"/>
+        <w:rPr/>
+      </w:pPr>
+      <w:r>
+        <w:rPr>
+          <w:rtl w:val="0"/>
+        </w:rPr>
+        <w:t xml:space="preserve">            elif agent == 'debug':</w:t>
+      </w:r>
+    </w:p>
+    <w:p>
+      <w:pPr>
+        <w:keepNext w:val="0"/>
+        <w:keepLines w:val="0"/>
+        <w:pageBreakBefore w:val="0"/>
+        <w:widowControl w:val="0"/>
+        <w:pBdr>
+          <w:top w:space="0" w:sz="0" w:val="nil"/>
+          <w:left w:space="0" w:sz="0" w:val="nil"/>
+          <w:bottom w:space="0" w:sz="0" w:val="nil"/>
+          <w:right w:space="0" w:sz="0" w:val="nil"/>
+          <w:between w:space="0" w:sz="0" w:val="nil"/>
+        </w:pBdr>
+        <w:shd w:fill="auto" w:val="clear"/>
+        <w:spacing w:after="0" w:before="0" w:line="276" w:lineRule="auto"/>
+        <w:ind w:left="0" w:right="0" w:firstLine="0"/>
+        <w:jc w:val="left"/>
+        <w:rPr/>
+      </w:pPr>
+      <w:r>
+        <w:rPr>
+          <w:rtl w:val="0"/>
+        </w:rPr>
+        <w:t xml:space="preserve">                result = debug_gate(coder_output, validation_task)</w:t>
+      </w:r>
+    </w:p>
+    <w:p>
+      <w:pPr>
+        <w:keepNext w:val="0"/>
+        <w:keepLines w:val="0"/>
+        <w:pageBreakBefore w:val="0"/>
+        <w:widowControl w:val="0"/>
+        <w:pBdr>
+          <w:top w:space="0" w:sz="0" w:val="nil"/>
+          <w:left w:space="0" w:sz="0" w:val="nil"/>
+          <w:bottom w:space="0" w:sz="0" w:val="nil"/>
+          <w:right w:space="0" w:sz="0" w:val="nil"/>
+          <w:between w:space="0" w:sz="0" w:val="nil"/>
+        </w:pBdr>
+        <w:shd w:fill="auto" w:val="clear"/>
+        <w:spacing w:after="0" w:before="0" w:line="276" w:lineRule="auto"/>
+        <w:ind w:left="0" w:right="0" w:firstLine="0"/>
+        <w:jc w:val="left"/>
+        <w:rPr/>
+      </w:pPr>
+      <w:r>
+        <w:rPr>
+          <w:rtl w:val="0"/>
+        </w:rPr>
+        <w:t xml:space="preserve">            else:</w:t>
+      </w:r>
+    </w:p>
+    <w:p>
+      <w:pPr>
+        <w:keepNext w:val="0"/>
+        <w:keepLines w:val="0"/>
+        <w:pageBreakBefore w:val="0"/>
+        <w:widowControl w:val="0"/>
+        <w:pBdr>
+          <w:top w:space="0" w:sz="0" w:val="nil"/>
+          <w:left w:space="0" w:sz="0" w:val="nil"/>
+          <w:bottom w:space="0" w:sz="0" w:val="nil"/>
+          <w:right w:space="0" w:sz="0" w:val="nil"/>
+          <w:between w:space="0" w:sz="0" w:val="nil"/>
+        </w:pBdr>
+        <w:shd w:fill="auto" w:val="clear"/>
+        <w:spacing w:after="0" w:before="0" w:line="276" w:lineRule="auto"/>
+        <w:ind w:left="0" w:right="0" w:firstLine="0"/>
+        <w:jc w:val="left"/>
+        <w:rPr/>
+      </w:pPr>
+      <w:r>
+        <w:rPr>
+          <w:rtl w:val="0"/>
+        </w:rPr>
+        <w:t xml:space="preserve">                result = knowledge_retrieval(task, rag_context, graph_context)</w:t>
+      </w:r>
+    </w:p>
+    <w:p>
+      <w:pPr>
+        <w:keepNext w:val="0"/>
+        <w:keepLines w:val="0"/>
+        <w:pageBreakBefore w:val="0"/>
+        <w:widowControl w:val="0"/>
+        <w:pBdr>
+          <w:top w:space="0" w:sz="0" w:val="nil"/>
+          <w:left w:space="0" w:sz="0" w:val="nil"/>
+          <w:bottom w:space="0" w:sz="0" w:val="nil"/>
+          <w:right w:space="0" w:sz="0" w:val="nil"/>
+          <w:between w:space="0" w:sz="0" w:val="nil"/>
+        </w:pBdr>
+        <w:shd w:fill="auto" w:val="clear"/>
+        <w:spacing w:after="0" w:before="0" w:line="276" w:lineRule="auto"/>
+        <w:ind w:left="0" w:right="0" w:firstLine="0"/>
+        <w:jc w:val="left"/>
+        <w:rPr/>
+      </w:pPr>
+      <w:r>
+        <w:rPr>
+          <w:rtl w:val="0"/>
+        </w:rPr>
+        <w:t xml:space="preserve">            # Publish result back to moderator queue</w:t>
+      </w:r>
+    </w:p>
+    <w:p>
+      <w:pPr>
+        <w:keepNext w:val="0"/>
+        <w:keepLines w:val="0"/>
+        <w:pageBreakBefore w:val="0"/>
+        <w:widowControl w:val="0"/>
+        <w:pBdr>
+          <w:top w:space="0" w:sz="0" w:val="nil"/>
+          <w:left w:space="0" w:sz="0" w:val="nil"/>
+          <w:bottom w:space="0" w:sz="0" w:val="nil"/>
+          <w:right w:space="0" w:sz="0" w:val="nil"/>
+          <w:between w:space="0" w:sz="0" w:val="nil"/>
+        </w:pBdr>
+        <w:shd w:fill="auto" w:val="clear"/>
+        <w:spacing w:after="0" w:before="0" w:line="276" w:lineRule="auto"/>
+        <w:ind w:left="0" w:right="0" w:firstLine="0"/>
+        <w:jc w:val="left"/>
+        <w:rPr/>
+      </w:pPr>
+      <w:r>
+        <w:rPr>
+          <w:rtl w:val="0"/>
+        </w:rPr>
+        <w:t xml:space="preserve">            sqs_send(Q_MODERATOR, {'agent': agent, 'result': result})</w:t>
+      </w:r>
+    </w:p>
+    <w:p>
+      <w:pPr>
+        <w:keepNext w:val="0"/>
+        <w:keepLines w:val="0"/>
+        <w:pageBreakBefore w:val="0"/>
+        <w:widowControl w:val="0"/>
+        <w:pBdr>
+          <w:top w:space="0" w:sz="0" w:val="nil"/>
+          <w:left w:space="0" w:sz="0" w:val="nil"/>
+          <w:bottom w:space="0" w:sz="0" w:val="nil"/>
+          <w:right w:space="0" w:sz="0" w:val="nil"/>
+          <w:between w:space="0" w:sz="0" w:val="nil"/>
+        </w:pBdr>
+        <w:shd w:fill="auto" w:val="clear"/>
+        <w:spacing w:after="0" w:before="0" w:line="276" w:lineRule="auto"/>
+        <w:ind w:left="0" w:right="0" w:firstLine="0"/>
+        <w:jc w:val="left"/>
+        <w:rPr/>
+      </w:pPr>
+      <w:r>
+        <w:rPr>
+          <w:rtl w:val="0"/>
+        </w:rPr>
+        <w:t xml:space="preserve">            results.append({'agent': agent, 'status': 'complete'})</w:t>
+      </w:r>
+    </w:p>
+    <w:p>
+      <w:pPr>
+        <w:keepNext w:val="0"/>
+        <w:keepLines w:val="0"/>
+        <w:pageBreakBefore w:val="0"/>
+        <w:widowControl w:val="0"/>
+        <w:pBdr>
+          <w:top w:space="0" w:sz="0" w:val="nil"/>
+          <w:left w:space="0" w:sz="0" w:val="nil"/>
+          <w:bottom w:space="0" w:sz="0" w:val="nil"/>
+          <w:right w:space="0" w:sz="0" w:val="nil"/>
+          <w:between w:space="0" w:sz="0" w:val="nil"/>
+        </w:pBdr>
+        <w:shd w:fill="auto" w:val="clear"/>
+        <w:spacing w:after="0" w:before="0" w:line="276" w:lineRule="auto"/>
+        <w:ind w:left="0" w:right="0" w:firstLine="0"/>
+        <w:jc w:val="left"/>
+        <w:rPr/>
+      </w:pPr>
+      <w:r>
+        <w:rPr>
+          <w:rtl w:val="0"/>
+        </w:rPr>
+        <w:t xml:space="preserve">        return {'statusCode': 200, 'body': json.dumps({'processed': results})}</w:t>
+      </w:r>
+    </w:p>
+    <w:p>
+      <w:pPr>
+        <w:keepNext w:val="0"/>
+        <w:keepLines w:val="0"/>
+        <w:pageBreakBefore w:val="0"/>
+        <w:widowControl w:val="0"/>
+        <w:pBdr>
+          <w:top w:space="0" w:sz="0" w:val="nil"/>
+          <w:left w:space="0" w:sz="0" w:val="nil"/>
+          <w:bottom w:space="0" w:sz="0" w:val="nil"/>
+          <w:right w:space="0" w:sz="0" w:val="nil"/>
+          <w:between w:space="0" w:sz="0" w:val="nil"/>
+        </w:pBdr>
+        <w:shd w:fill="auto" w:val="clear"/>
+        <w:spacing w:after="0" w:before="0" w:line="276" w:lineRule="auto"/>
+        <w:ind w:left="0" w:right="0" w:firstLine="0"/>
+        <w:jc w:val="left"/>
+        <w:rPr/>
+      </w:pPr>
+      <w:r>
+        <w:rPr>
+          <w:rtl w:val="0"/>
+        </w:rPr>
+      </w:r>
+    </w:p>
+    <w:p>
+      <w:pPr>
+        <w:keepNext w:val="0"/>
+        <w:keepLines w:val="0"/>
+        <w:pageBreakBefore w:val="0"/>
+        <w:widowControl w:val="0"/>
+        <w:pBdr>
+          <w:top w:space="0" w:sz="0" w:val="nil"/>
+          <w:left w:space="0" w:sz="0" w:val="nil"/>
+          <w:bottom w:space="0" w:sz="0" w:val="nil"/>
+          <w:right w:space="0" w:sz="0" w:val="nil"/>
+          <w:between w:space="0" w:sz="0" w:val="nil"/>
+        </w:pBdr>
+        <w:shd w:fill="auto" w:val="clear"/>
+        <w:spacing w:after="0" w:before="0" w:line="276" w:lineRule="auto"/>
+        <w:ind w:left="0" w:right="0" w:firstLine="0"/>
+        <w:jc w:val="left"/>
+        <w:rPr/>
+      </w:pPr>
+      <w:r>
+        <w:rPr>
+          <w:rtl w:val="0"/>
+        </w:rPr>
+        <w:t xml:space="preserve">    # Direct HTTP invocation mode -- standard pipeline</w:t>
+      </w:r>
+    </w:p>
+    <w:p>
+      <w:pPr>
+        <w:keepNext w:val="0"/>
+        <w:keepLines w:val="0"/>
+        <w:pageBreakBefore w:val="0"/>
+        <w:widowControl w:val="0"/>
+        <w:pBdr>
+          <w:top w:space="0" w:sz="0" w:val="nil"/>
+          <w:left w:space="0" w:sz="0" w:val="nil"/>
+          <w:bottom w:space="0" w:sz="0" w:val="nil"/>
+          <w:right w:space="0" w:sz="0" w:val="nil"/>
+          <w:between w:space="0" w:sz="0" w:val="nil"/>
+        </w:pBdr>
+        <w:shd w:fill="auto" w:val="clear"/>
+        <w:spacing w:after="0" w:before="0" w:line="276" w:lineRule="auto"/>
+        <w:ind w:left="0" w:right="0" w:firstLine="0"/>
+        <w:jc w:val="left"/>
+        <w:rPr/>
+      </w:pPr>
+      <w:r>
+        <w:rPr>
+          <w:rtl w:val="0"/>
+        </w:rPr>
         <w:t xml:space="preserve">    body = json.loads(event.get('body', '{}')) if isinstance(event.get('body'), str) else event</w:t>
       </w:r>
     </w:p>
@@ -1482,6 +4278,32 @@
         <w:rPr>
           <w:rtl w:val="0"/>
         </w:rPr>
+        <w:t xml:space="preserve">    use_sqs = body.get('use_sqs', True)</w:t>
+      </w:r>
+    </w:p>
+    <w:p>
+      <w:pPr>
+        <w:keepNext w:val="0"/>
+        <w:keepLines w:val="0"/>
+        <w:pageBreakBefore w:val="0"/>
+        <w:widowControl w:val="0"/>
+        <w:pBdr>
+          <w:top w:space="0" w:sz="0" w:val="nil"/>
+          <w:left w:space="0" w:sz="0" w:val="nil"/>
+          <w:bottom w:space="0" w:sz="0" w:val="nil"/>
+          <w:right w:space="0" w:sz="0" w:val="nil"/>
+          <w:between w:space="0" w:sz="0" w:val="nil"/>
+        </w:pBdr>
+        <w:shd w:fill="auto" w:val="clear"/>
+        <w:spacing w:after="0" w:before="0" w:line="276" w:lineRule="auto"/>
+        <w:ind w:left="0" w:right="0" w:firstLine="0"/>
+        <w:jc w:val="left"/>
+        <w:rPr/>
+      </w:pPr>
+      <w:r>
+        <w:rPr>
+          <w:rtl w:val="0"/>
+        </w:rPr>
         <w:t xml:space="preserve">    if not task:</w:t>
       </w:r>
     </w:p>
@@ -1611,31 +4433,6 @@
         <w:rPr>
           <w:rtl w:val="0"/>
         </w:rPr>
-      </w:r>
-    </w:p>
-    <w:p>
-      <w:pPr>
-        <w:keepNext w:val="0"/>
-        <w:keepLines w:val="0"/>
-        <w:pageBreakBefore w:val="0"/>
-        <w:widowControl w:val="0"/>
-        <w:pBdr>
-          <w:top w:space="0" w:sz="0" w:val="nil"/>
-          <w:left w:space="0" w:sz="0" w:val="nil"/>
-          <w:bottom w:space="0" w:sz="0" w:val="nil"/>
-          <w:right w:space="0" w:sz="0" w:val="nil"/>
-          <w:between w:space="0" w:sz="0" w:val="nil"/>
-        </w:pBdr>
-        <w:shd w:fill="auto" w:val="clear"/>
-        <w:spacing w:after="0" w:before="0" w:line="276" w:lineRule="auto"/>
-        <w:ind w:left="0" w:right="0" w:firstLine="0"/>
-        <w:jc w:val="left"/>
-        <w:rPr/>
-      </w:pPr>
-      <w:r>
-        <w:rPr>
-          <w:rtl w:val="0"/>
-        </w:rPr>
         <w:t xml:space="preserve">    plan = moderator(task, rag_context, graph_context)</w:t>
       </w:r>
     </w:p>
@@ -1920,59 +4717,137 @@
         <w:rPr>
           <w:rtl w:val="0"/>
         </w:rPr>
-        <w:t xml:space="preserve">    kr_output = knowledge_retrieval(sections['RETRIEVAL'], rag_context, graph_context)</w:t>
-      </w:r>
-    </w:p>
-    <w:p>
-      <w:pPr>
-        <w:keepNext w:val="0"/>
-        <w:keepLines w:val="0"/>
-        <w:pageBreakBefore w:val="0"/>
-        <w:widowControl w:val="0"/>
-        <w:pBdr>
-          <w:top w:space="0" w:sz="0" w:val="nil"/>
-          <w:left w:space="0" w:sz="0" w:val="nil"/>
-          <w:bottom w:space="0" w:sz="0" w:val="nil"/>
-          <w:right w:space="0" w:sz="0" w:val="nil"/>
-          <w:between w:space="0" w:sz="0" w:val="nil"/>
-        </w:pBdr>
-        <w:shd w:fill="auto" w:val="clear"/>
-        <w:spacing w:after="0" w:before="0" w:line="276" w:lineRule="auto"/>
-        <w:ind w:left="0" w:right="0" w:firstLine="0"/>
-        <w:jc w:val="left"/>
-        <w:rPr/>
-      </w:pPr>
-      <w:r>
-        <w:rPr>
-          <w:rtl w:val="0"/>
-        </w:rPr>
-        <w:t xml:space="preserve">    coder_output = coder(sections['OUTPUT'], kr_output)</w:t>
-      </w:r>
-    </w:p>
-    <w:p>
-      <w:pPr>
-        <w:keepNext w:val="0"/>
-        <w:keepLines w:val="0"/>
-        <w:pageBreakBefore w:val="0"/>
-        <w:widowControl w:val="0"/>
-        <w:pBdr>
-          <w:top w:space="0" w:sz="0" w:val="nil"/>
-          <w:left w:space="0" w:sz="0" w:val="nil"/>
-          <w:bottom w:space="0" w:sz="0" w:val="nil"/>
-          <w:right w:space="0" w:sz="0" w:val="nil"/>
-          <w:between w:space="0" w:sz="0" w:val="nil"/>
-        </w:pBdr>
-        <w:shd w:fill="auto" w:val="clear"/>
-        <w:spacing w:after="0" w:before="0" w:line="276" w:lineRule="auto"/>
-        <w:ind w:left="0" w:right="0" w:firstLine="0"/>
-        <w:jc w:val="left"/>
-        <w:rPr/>
-      </w:pPr>
-      <w:r>
-        <w:rPr>
-          <w:rtl w:val="0"/>
-        </w:rPr>
-        <w:t xml:space="preserve">    final_output = debug_gate(coder_output, sections['VALIDATION'])</w:t>
+        <w:t xml:space="preserve">    if use_sqs:</w:t>
+      </w:r>
+    </w:p>
+    <w:p>
+      <w:pPr>
+        <w:keepNext w:val="0"/>
+        <w:keepLines w:val="0"/>
+        <w:pageBreakBefore w:val="0"/>
+        <w:widowControl w:val="0"/>
+        <w:pBdr>
+          <w:top w:space="0" w:sz="0" w:val="nil"/>
+          <w:left w:space="0" w:sz="0" w:val="nil"/>
+          <w:bottom w:space="0" w:sz="0" w:val="nil"/>
+          <w:right w:space="0" w:sz="0" w:val="nil"/>
+          <w:between w:space="0" w:sz="0" w:val="nil"/>
+        </w:pBdr>
+        <w:shd w:fill="auto" w:val="clear"/>
+        <w:spacing w:after="0" w:before="0" w:line="276" w:lineRule="auto"/>
+        <w:ind w:left="0" w:right="0" w:firstLine="0"/>
+        <w:jc w:val="left"/>
+        <w:rPr/>
+      </w:pPr>
+      <w:r>
+        <w:rPr>
+          <w:rtl w:val="0"/>
+        </w:rPr>
+        <w:t xml:space="preserve">        kr_output, coder_output, final_output = run_pipeline_sqs(task, rag_context, graph_context, plan, sections)</w:t>
+      </w:r>
+    </w:p>
+    <w:p>
+      <w:pPr>
+        <w:keepNext w:val="0"/>
+        <w:keepLines w:val="0"/>
+        <w:pageBreakBefore w:val="0"/>
+        <w:widowControl w:val="0"/>
+        <w:pBdr>
+          <w:top w:space="0" w:sz="0" w:val="nil"/>
+          <w:left w:space="0" w:sz="0" w:val="nil"/>
+          <w:bottom w:space="0" w:sz="0" w:val="nil"/>
+          <w:right w:space="0" w:sz="0" w:val="nil"/>
+          <w:between w:space="0" w:sz="0" w:val="nil"/>
+        </w:pBdr>
+        <w:shd w:fill="auto" w:val="clear"/>
+        <w:spacing w:after="0" w:before="0" w:line="276" w:lineRule="auto"/>
+        <w:ind w:left="0" w:right="0" w:firstLine="0"/>
+        <w:jc w:val="left"/>
+        <w:rPr/>
+      </w:pPr>
+      <w:r>
+        <w:rPr>
+          <w:rtl w:val="0"/>
+        </w:rPr>
+        <w:t xml:space="preserve">    else:</w:t>
+      </w:r>
+    </w:p>
+    <w:p>
+      <w:pPr>
+        <w:keepNext w:val="0"/>
+        <w:keepLines w:val="0"/>
+        <w:pageBreakBefore w:val="0"/>
+        <w:widowControl w:val="0"/>
+        <w:pBdr>
+          <w:top w:space="0" w:sz="0" w:val="nil"/>
+          <w:left w:space="0" w:sz="0" w:val="nil"/>
+          <w:bottom w:space="0" w:sz="0" w:val="nil"/>
+          <w:right w:space="0" w:sz="0" w:val="nil"/>
+          <w:between w:space="0" w:sz="0" w:val="nil"/>
+        </w:pBdr>
+        <w:shd w:fill="auto" w:val="clear"/>
+        <w:spacing w:after="0" w:before="0" w:line="276" w:lineRule="auto"/>
+        <w:ind w:left="0" w:right="0" w:firstLine="0"/>
+        <w:jc w:val="left"/>
+        <w:rPr/>
+      </w:pPr>
+      <w:r>
+        <w:rPr>
+          <w:rtl w:val="0"/>
+        </w:rPr>
+        <w:t xml:space="preserve">        kr_output = knowledge_retrieval(sections['RETRIEVAL'], rag_context, graph_context)</w:t>
+      </w:r>
+    </w:p>
+    <w:p>
+      <w:pPr>
+        <w:keepNext w:val="0"/>
+        <w:keepLines w:val="0"/>
+        <w:pageBreakBefore w:val="0"/>
+        <w:widowControl w:val="0"/>
+        <w:pBdr>
+          <w:top w:space="0" w:sz="0" w:val="nil"/>
+          <w:left w:space="0" w:sz="0" w:val="nil"/>
+          <w:bottom w:space="0" w:sz="0" w:val="nil"/>
+          <w:right w:space="0" w:sz="0" w:val="nil"/>
+          <w:between w:space="0" w:sz="0" w:val="nil"/>
+        </w:pBdr>
+        <w:shd w:fill="auto" w:val="clear"/>
+        <w:spacing w:after="0" w:before="0" w:line="276" w:lineRule="auto"/>
+        <w:ind w:left="0" w:right="0" w:firstLine="0"/>
+        <w:jc w:val="left"/>
+        <w:rPr/>
+      </w:pPr>
+      <w:r>
+        <w:rPr>
+          <w:rtl w:val="0"/>
+        </w:rPr>
+        <w:t xml:space="preserve">        coder_output = coder(sections['OUTPUT'], kr_output)</w:t>
+      </w:r>
+    </w:p>
+    <w:p>
+      <w:pPr>
+        <w:keepNext w:val="0"/>
+        <w:keepLines w:val="0"/>
+        <w:pageBreakBefore w:val="0"/>
+        <w:widowControl w:val="0"/>
+        <w:pBdr>
+          <w:top w:space="0" w:sz="0" w:val="nil"/>
+          <w:left w:space="0" w:sz="0" w:val="nil"/>
+          <w:bottom w:space="0" w:sz="0" w:val="nil"/>
+          <w:right w:space="0" w:sz="0" w:val="nil"/>
+          <w:between w:space="0" w:sz="0" w:val="nil"/>
+        </w:pBdr>
+        <w:shd w:fill="auto" w:val="clear"/>
+        <w:spacing w:after="0" w:before="0" w:line="276" w:lineRule="auto"/>
+        <w:ind w:left="0" w:right="0" w:firstLine="0"/>
+        <w:jc w:val="left"/>
+        <w:rPr/>
+      </w:pPr>
+      <w:r>
+        <w:rPr>
+          <w:rtl w:val="0"/>
+        </w:rPr>
+        <w:t xml:space="preserve">        final_output = debug_gate(coder_output, sections['VALIDATION'])</w:t>
       </w:r>
     </w:p>
     <w:p>

</xml_diff>